<commit_message>
Investigate the unusual high Non Refund cancellation rate
</commit_message>
<xml_diff>
--- a/Report/Report.docx
+++ b/Report/Report.docx
@@ -617,28 +617,22 @@
           <w:sz w:val="40"/>
           <w:szCs w:val="40"/>
         </w:rPr>
-        <w:t xml:space="preserve">Overall </w:t>
-      </w:r>
-      <w:r>
-        <w:rPr>
-          <w:b/>
-          <w:bCs/>
-          <w:sz w:val="40"/>
-          <w:szCs w:val="40"/>
-        </w:rPr>
-        <w:t>Cancellation Rate</w:t>
-      </w:r>
-    </w:p>
-    <w:p>
-      <w:pPr>
-        <w:spacing w:line="240" w:lineRule="auto"/>
-      </w:pPr>
-    </w:p>
-    <w:p>
-      <w:pPr>
-        <w:spacing w:line="240" w:lineRule="auto"/>
-      </w:pPr>
-      <w:r>
+        <w:t>Overall Cancellation Rate</w:t>
+      </w:r>
+    </w:p>
+    <w:p>
+      <w:pPr>
+        <w:spacing w:line="240" w:lineRule="auto"/>
+      </w:pPr>
+    </w:p>
+    <w:p>
+      <w:pPr>
+        <w:spacing w:line="240" w:lineRule="auto"/>
+      </w:pPr>
+      <w:r>
+        <w:rPr>
+          <w:noProof/>
+        </w:rPr>
         <w:drawing>
           <wp:inline distT="0" distB="0" distL="0" distR="0" wp14:anchorId="79052015" wp14:editId="54ACCEF9">
             <wp:extent cx="2886478" cy="1009791"/>
@@ -681,6 +675,9 @@
         <w:spacing w:line="240" w:lineRule="auto"/>
       </w:pPr>
       <w:r>
+        <w:rPr>
+          <w:noProof/>
+        </w:rPr>
         <w:lastRenderedPageBreak/>
         <w:drawing>
           <wp:inline distT="0" distB="0" distL="0" distR="0" wp14:anchorId="77166F80" wp14:editId="11D725F4">
@@ -892,6 +889,7 @@
         <w:rPr>
           <w:b/>
           <w:bCs/>
+          <w:noProof/>
           <w:sz w:val="40"/>
           <w:szCs w:val="40"/>
         </w:rPr>
@@ -946,6 +944,7 @@
         <w:rPr>
           <w:b/>
           <w:bCs/>
+          <w:noProof/>
           <w:sz w:val="40"/>
           <w:szCs w:val="40"/>
         </w:rPr>
@@ -1057,117 +1056,111 @@
         <w:t>Business Interpretation:</w:t>
       </w:r>
       <w:r>
+        <w:t xml:space="preserve"> Cancellation rates differ between the two hotel types. </w:t>
+      </w:r>
+      <w:r>
+        <w:t xml:space="preserve">City hotel </w:t>
+      </w:r>
+      <w:r>
+        <w:t xml:space="preserve">has a cancellation rate of </w:t>
+      </w:r>
+      <w:r>
+        <w:t>41.71</w:t>
+      </w:r>
+      <w:r>
+        <w:t xml:space="preserve">%, compared with </w:t>
+      </w:r>
+      <w:r>
+        <w:t>27.98</w:t>
+      </w:r>
+      <w:r>
+        <w:t xml:space="preserve">% for </w:t>
+      </w:r>
+      <w:r>
+        <w:t xml:space="preserve">Resort </w:t>
+      </w:r>
+      <w:proofErr w:type="gramStart"/>
+      <w:r>
+        <w:t xml:space="preserve">hotel </w:t>
+      </w:r>
+      <w:r>
+        <w:t>,</w:t>
+      </w:r>
+      <w:proofErr w:type="gramEnd"/>
+      <w:r>
+        <w:t xml:space="preserve"> a difference of </w:t>
+      </w:r>
+      <w:r>
+        <w:t>13.73</w:t>
+      </w:r>
+      <w:r>
+        <w:t xml:space="preserve"> percentage points. This indicates that bookings at </w:t>
+      </w:r>
+      <w:r>
+        <w:t xml:space="preserve">City </w:t>
+      </w:r>
+      <w:r>
+        <w:t>hotel are more likely to be cance</w:t>
+      </w:r>
+      <w:r>
+        <w:t>l</w:t>
+      </w:r>
+      <w:r>
+        <w:t xml:space="preserve">led. Therefore, </w:t>
+      </w:r>
+      <w:r>
+        <w:t>City</w:t>
+      </w:r>
+      <w:r>
+        <w:t xml:space="preserve"> hotel</w:t>
+      </w:r>
+      <w:r>
+        <w:t>s</w:t>
+      </w:r>
+      <w:r>
+        <w:t xml:space="preserve"> may require greater attention to cancellation-management strategies, such as reviewing pricing, deposit policies, and booking conditions.</w:t>
+      </w:r>
+    </w:p>
+    <w:p>
+      <w:pPr>
+        <w:spacing w:line="240" w:lineRule="auto"/>
+        <w:rPr>
+          <w:b/>
+          <w:bCs/>
+          <w:sz w:val="32"/>
+          <w:szCs w:val="32"/>
+        </w:rPr>
+      </w:pPr>
+      <w:r>
+        <w:rPr>
+          <w:b/>
+          <w:bCs/>
+          <w:sz w:val="32"/>
+          <w:szCs w:val="32"/>
+        </w:rPr>
+        <w:t>Next step</w:t>
+      </w:r>
+    </w:p>
+    <w:p>
+      <w:pPr>
+        <w:spacing w:line="240" w:lineRule="auto"/>
+      </w:pPr>
+      <w:r>
+        <w:rPr>
+          <w:b/>
+          <w:bCs/>
+        </w:rPr>
+        <w:t>Next Step:</w:t>
+      </w:r>
+      <w:r>
+        <w:rPr>
+          <w:b/>
+          <w:bCs/>
+        </w:rPr>
         <w:t xml:space="preserve"> </w:t>
       </w:r>
       <w:r>
-        <w:t xml:space="preserve">Cancellation rates differ between the two hotel types. </w:t>
-      </w:r>
-      <w:r>
-        <w:t xml:space="preserve">City hotel </w:t>
-      </w:r>
-      <w:r>
-        <w:t xml:space="preserve">has a cancellation rate of </w:t>
-      </w:r>
-      <w:r>
-        <w:t>41.71</w:t>
-      </w:r>
-      <w:r>
-        <w:t xml:space="preserve">%, compared with </w:t>
-      </w:r>
-      <w:r>
-        <w:t>27.98</w:t>
-      </w:r>
-      <w:r>
-        <w:t xml:space="preserve">% for </w:t>
-      </w:r>
-      <w:r>
-        <w:t xml:space="preserve">Resort </w:t>
-      </w:r>
-      <w:proofErr w:type="gramStart"/>
-      <w:r>
-        <w:t xml:space="preserve">hotel </w:t>
-      </w:r>
-      <w:r>
-        <w:t>,</w:t>
-      </w:r>
-      <w:proofErr w:type="gramEnd"/>
-      <w:r>
-        <w:t xml:space="preserve"> a difference of </w:t>
-      </w:r>
-      <w:r>
-        <w:t>13.73</w:t>
-      </w:r>
-      <w:r>
-        <w:t xml:space="preserve"> percentage points. This indicates that bookings at </w:t>
-      </w:r>
-      <w:r>
-        <w:t xml:space="preserve">City </w:t>
-      </w:r>
-      <w:r>
-        <w:t>hotel are more likely to be cance</w:t>
-      </w:r>
-      <w:r>
-        <w:t>l</w:t>
-      </w:r>
-      <w:r>
-        <w:t xml:space="preserve">led. Therefore, </w:t>
-      </w:r>
-      <w:r>
-        <w:t>City</w:t>
-      </w:r>
-      <w:r>
-        <w:t xml:space="preserve"> hotel</w:t>
-      </w:r>
-      <w:r>
-        <w:t>s</w:t>
-      </w:r>
-      <w:r>
-        <w:t xml:space="preserve"> may require greater attention to cancellation-management strategies, such as reviewing pricing, deposit policies, and booking conditions.</w:t>
-      </w:r>
-    </w:p>
-    <w:p>
-      <w:pPr>
-        <w:spacing w:line="240" w:lineRule="auto"/>
-        <w:rPr>
-          <w:b/>
-          <w:bCs/>
-          <w:sz w:val="32"/>
-          <w:szCs w:val="32"/>
-        </w:rPr>
-      </w:pPr>
-      <w:r>
-        <w:rPr>
-          <w:b/>
-          <w:bCs/>
-          <w:sz w:val="32"/>
-          <w:szCs w:val="32"/>
-        </w:rPr>
-        <w:t>Next step</w:t>
-      </w:r>
-    </w:p>
-    <w:p>
-      <w:pPr>
-        <w:spacing w:line="240" w:lineRule="auto"/>
-      </w:pPr>
-      <w:r>
-        <w:rPr>
-          <w:b/>
-          <w:bCs/>
-        </w:rPr>
-        <w:t>Next Step:</w:t>
-      </w:r>
-      <w:r>
-        <w:rPr>
-          <w:b/>
-          <w:bCs/>
-        </w:rPr>
-        <w:t xml:space="preserve"> </w:t>
-      </w:r>
-      <w:r>
-        <w:t xml:space="preserve"> </w:t>
-      </w:r>
-      <w:r>
-        <w:t>Cancellation Rate by Lead Time</w:t>
+        <w:t xml:space="preserve"> Cancellation Rate by Lead Time</w:t>
       </w:r>
     </w:p>
     <w:p>
@@ -1203,32 +1196,24 @@
           <w:sz w:val="40"/>
           <w:szCs w:val="40"/>
         </w:rPr>
-        <w:t xml:space="preserve">Cancellation Rate by </w:t>
-      </w:r>
-      <w:r>
+        <w:t>Cancellation Rate by Lead Time</w:t>
+      </w:r>
+    </w:p>
+    <w:p>
+      <w:pPr>
+        <w:spacing w:line="240" w:lineRule="auto"/>
         <w:rPr>
           <w:b/>
           <w:bCs/>
           <w:sz w:val="40"/>
           <w:szCs w:val="40"/>
         </w:rPr>
-        <w:t>Lead Time</w:t>
-      </w:r>
-    </w:p>
-    <w:p>
-      <w:pPr>
-        <w:spacing w:line="240" w:lineRule="auto"/>
-        <w:rPr>
-          <w:b/>
-          <w:bCs/>
-          <w:sz w:val="40"/>
-          <w:szCs w:val="40"/>
-        </w:rPr>
-      </w:pPr>
-      <w:r>
-        <w:rPr>
-          <w:b/>
-          <w:bCs/>
+      </w:pPr>
+      <w:r>
+        <w:rPr>
+          <w:b/>
+          <w:bCs/>
+          <w:noProof/>
           <w:sz w:val="40"/>
           <w:szCs w:val="40"/>
         </w:rPr>
@@ -1284,6 +1269,7 @@
         <w:rPr>
           <w:b/>
           <w:bCs/>
+          <w:noProof/>
           <w:sz w:val="40"/>
           <w:szCs w:val="40"/>
         </w:rPr>
@@ -1777,6 +1763,7 @@
         <w:rPr>
           <w:b/>
           <w:bCs/>
+          <w:noProof/>
           <w:sz w:val="40"/>
           <w:szCs w:val="40"/>
         </w:rPr>
@@ -1822,6 +1809,7 @@
         <w:rPr>
           <w:b/>
           <w:bCs/>
+          <w:noProof/>
           <w:sz w:val="40"/>
           <w:szCs w:val="40"/>
         </w:rPr>
@@ -2109,13 +2097,793 @@
         <w:t xml:space="preserve"> to identify which customer segments and booking channels have the highest cancellation risk.</w:t>
       </w:r>
     </w:p>
-    <w:p>
-      <w:pPr>
-        <w:rPr>
-          <w:b/>
-          <w:bCs/>
-        </w:rPr>
-      </w:pPr>
+    <w:p/>
+    <w:p>
+      <w:pPr>
+        <w:rPr>
+          <w:b/>
+          <w:bCs/>
+          <w:sz w:val="36"/>
+          <w:szCs w:val="36"/>
+        </w:rPr>
+      </w:pPr>
+      <w:r>
+        <w:rPr>
+          <w:b/>
+          <w:bCs/>
+          <w:sz w:val="36"/>
+          <w:szCs w:val="36"/>
+        </w:rPr>
+        <w:t xml:space="preserve">Step </w:t>
+      </w:r>
+      <w:proofErr w:type="gramStart"/>
+      <w:r>
+        <w:rPr>
+          <w:b/>
+          <w:bCs/>
+          <w:sz w:val="36"/>
+          <w:szCs w:val="36"/>
+        </w:rPr>
+        <w:t>4.1 :</w:t>
+      </w:r>
+      <w:proofErr w:type="gramEnd"/>
+      <w:r>
+        <w:rPr>
+          <w:b/>
+          <w:bCs/>
+          <w:sz w:val="36"/>
+          <w:szCs w:val="36"/>
+        </w:rPr>
+        <w:t xml:space="preserve"> </w:t>
+      </w:r>
+      <w:r>
+        <w:rPr>
+          <w:b/>
+          <w:bCs/>
+          <w:sz w:val="36"/>
+          <w:szCs w:val="36"/>
+        </w:rPr>
+        <w:t xml:space="preserve">Investigate the unusual high </w:t>
+      </w:r>
+      <w:proofErr w:type="gramStart"/>
+      <w:r>
+        <w:rPr>
+          <w:b/>
+          <w:bCs/>
+          <w:sz w:val="36"/>
+          <w:szCs w:val="36"/>
+        </w:rPr>
+        <w:t>Non Refund</w:t>
+      </w:r>
+      <w:proofErr w:type="gramEnd"/>
+      <w:r>
+        <w:rPr>
+          <w:b/>
+          <w:bCs/>
+          <w:sz w:val="36"/>
+          <w:szCs w:val="36"/>
+        </w:rPr>
+        <w:t xml:space="preserve"> cancellation rate</w:t>
+      </w:r>
+    </w:p>
+    <w:p>
+      <w:pPr>
+        <w:spacing w:line="240" w:lineRule="auto"/>
+        <w:ind w:left="360"/>
+        <w:rPr>
+          <w:b/>
+          <w:bCs/>
+          <w:sz w:val="32"/>
+          <w:szCs w:val="32"/>
+        </w:rPr>
+      </w:pPr>
+      <w:r>
+        <w:rPr>
+          <w:b/>
+          <w:bCs/>
+          <w:sz w:val="32"/>
+          <w:szCs w:val="32"/>
+        </w:rPr>
+        <w:t xml:space="preserve">step </w:t>
+      </w:r>
+      <w:proofErr w:type="gramStart"/>
+      <w:r>
+        <w:rPr>
+          <w:b/>
+          <w:bCs/>
+          <w:sz w:val="32"/>
+          <w:szCs w:val="32"/>
+        </w:rPr>
+        <w:t>4.</w:t>
+      </w:r>
+      <w:r>
+        <w:rPr>
+          <w:b/>
+          <w:bCs/>
+          <w:sz w:val="32"/>
+          <w:szCs w:val="32"/>
+        </w:rPr>
+        <w:t>1 :</w:t>
+      </w:r>
+      <w:proofErr w:type="gramEnd"/>
+      <w:r>
+        <w:rPr>
+          <w:b/>
+          <w:bCs/>
+          <w:sz w:val="32"/>
+          <w:szCs w:val="32"/>
+        </w:rPr>
+        <w:t xml:space="preserve"> Check the sample size</w:t>
+      </w:r>
+    </w:p>
+    <w:p>
+      <w:pPr>
+        <w:spacing w:line="240" w:lineRule="auto"/>
+        <w:ind w:left="360"/>
+        <w:rPr>
+          <w:b/>
+          <w:bCs/>
+          <w:sz w:val="32"/>
+          <w:szCs w:val="32"/>
+        </w:rPr>
+      </w:pPr>
+    </w:p>
+    <w:p>
+      <w:pPr>
+        <w:spacing w:line="240" w:lineRule="auto"/>
+        <w:ind w:left="360"/>
+        <w:rPr>
+          <w:b/>
+          <w:bCs/>
+          <w:sz w:val="32"/>
+          <w:szCs w:val="32"/>
+        </w:rPr>
+      </w:pPr>
+      <w:r>
+        <w:rPr>
+          <w:b/>
+          <w:bCs/>
+          <w:sz w:val="32"/>
+          <w:szCs w:val="32"/>
+        </w:rPr>
+        <w:drawing>
+          <wp:inline distT="0" distB="0" distL="0" distR="0" wp14:anchorId="34274D22" wp14:editId="62C6DFF3">
+            <wp:extent cx="5534797" cy="1638529"/>
+            <wp:effectExtent l="0" t="0" r="0" b="0"/>
+            <wp:docPr id="1203828660" name="Picture 1"/>
+            <wp:cNvGraphicFramePr>
+              <a:graphicFrameLocks xmlns:a="http://schemas.openxmlformats.org/drawingml/2006/main" noChangeAspect="1"/>
+            </wp:cNvGraphicFramePr>
+            <a:graphic xmlns:a="http://schemas.openxmlformats.org/drawingml/2006/main">
+              <a:graphicData uri="http://schemas.openxmlformats.org/drawingml/2006/picture">
+                <pic:pic xmlns:pic="http://schemas.openxmlformats.org/drawingml/2006/picture">
+                  <pic:nvPicPr>
+                    <pic:cNvPr id="1203828660" name=""/>
+                    <pic:cNvPicPr/>
+                  </pic:nvPicPr>
+                  <pic:blipFill>
+                    <a:blip r:embed="rId13"/>
+                    <a:stretch>
+                      <a:fillRect/>
+                    </a:stretch>
+                  </pic:blipFill>
+                  <pic:spPr>
+                    <a:xfrm>
+                      <a:off x="0" y="0"/>
+                      <a:ext cx="5534797" cy="1638529"/>
+                    </a:xfrm>
+                    <a:prstGeom prst="rect">
+                      <a:avLst/>
+                    </a:prstGeom>
+                  </pic:spPr>
+                </pic:pic>
+              </a:graphicData>
+            </a:graphic>
+          </wp:inline>
+        </w:drawing>
+      </w:r>
+    </w:p>
+    <w:p>
+      <w:pPr>
+        <w:spacing w:line="240" w:lineRule="auto"/>
+        <w:ind w:left="360"/>
+        <w:rPr>
+          <w:b/>
+          <w:bCs/>
+          <w:sz w:val="32"/>
+          <w:szCs w:val="32"/>
+        </w:rPr>
+      </w:pPr>
+    </w:p>
+    <w:p>
+      <w:pPr>
+        <w:spacing w:line="240" w:lineRule="auto"/>
+        <w:ind w:left="360"/>
+        <w:rPr>
+          <w:b/>
+          <w:bCs/>
+          <w:sz w:val="32"/>
+          <w:szCs w:val="32"/>
+        </w:rPr>
+      </w:pPr>
+      <w:r>
+        <w:rPr>
+          <w:b/>
+          <w:bCs/>
+          <w:sz w:val="32"/>
+          <w:szCs w:val="32"/>
+        </w:rPr>
+        <w:t xml:space="preserve">step </w:t>
+      </w:r>
+      <w:r>
+        <w:rPr>
+          <w:b/>
+          <w:bCs/>
+          <w:sz w:val="32"/>
+          <w:szCs w:val="32"/>
+        </w:rPr>
+        <w:t>4.</w:t>
+      </w:r>
+      <w:r>
+        <w:rPr>
+          <w:b/>
+          <w:bCs/>
+          <w:sz w:val="32"/>
+          <w:szCs w:val="32"/>
+        </w:rPr>
+        <w:t xml:space="preserve">2: Look directly at the </w:t>
+      </w:r>
+      <w:proofErr w:type="gramStart"/>
+      <w:r>
+        <w:rPr>
+          <w:b/>
+          <w:bCs/>
+          <w:sz w:val="32"/>
+          <w:szCs w:val="32"/>
+        </w:rPr>
+        <w:t>Non Refund</w:t>
+      </w:r>
+      <w:proofErr w:type="gramEnd"/>
+      <w:r>
+        <w:rPr>
+          <w:b/>
+          <w:bCs/>
+          <w:sz w:val="32"/>
+          <w:szCs w:val="32"/>
+        </w:rPr>
+        <w:t xml:space="preserve"> bookings</w:t>
+      </w:r>
+    </w:p>
+    <w:p>
+      <w:pPr>
+        <w:spacing w:line="240" w:lineRule="auto"/>
+        <w:ind w:left="360"/>
+        <w:rPr>
+          <w:b/>
+          <w:bCs/>
+          <w:sz w:val="32"/>
+          <w:szCs w:val="32"/>
+        </w:rPr>
+      </w:pPr>
+      <w:r>
+        <w:rPr>
+          <w:b/>
+          <w:bCs/>
+          <w:sz w:val="32"/>
+          <w:szCs w:val="32"/>
+        </w:rPr>
+        <w:drawing>
+          <wp:inline distT="0" distB="0" distL="0" distR="0" wp14:anchorId="5EFD2517" wp14:editId="3084C8A9">
+            <wp:extent cx="3381847" cy="1047896"/>
+            <wp:effectExtent l="0" t="0" r="9525" b="0"/>
+            <wp:docPr id="778701970" name="Picture 1"/>
+            <wp:cNvGraphicFramePr>
+              <a:graphicFrameLocks xmlns:a="http://schemas.openxmlformats.org/drawingml/2006/main" noChangeAspect="1"/>
+            </wp:cNvGraphicFramePr>
+            <a:graphic xmlns:a="http://schemas.openxmlformats.org/drawingml/2006/main">
+              <a:graphicData uri="http://schemas.openxmlformats.org/drawingml/2006/picture">
+                <pic:pic xmlns:pic="http://schemas.openxmlformats.org/drawingml/2006/picture">
+                  <pic:nvPicPr>
+                    <pic:cNvPr id="778701970" name=""/>
+                    <pic:cNvPicPr/>
+                  </pic:nvPicPr>
+                  <pic:blipFill>
+                    <a:blip r:embed="rId14"/>
+                    <a:stretch>
+                      <a:fillRect/>
+                    </a:stretch>
+                  </pic:blipFill>
+                  <pic:spPr>
+                    <a:xfrm>
+                      <a:off x="0" y="0"/>
+                      <a:ext cx="3381847" cy="1047896"/>
+                    </a:xfrm>
+                    <a:prstGeom prst="rect">
+                      <a:avLst/>
+                    </a:prstGeom>
+                  </pic:spPr>
+                </pic:pic>
+              </a:graphicData>
+            </a:graphic>
+          </wp:inline>
+        </w:drawing>
+      </w:r>
+    </w:p>
+    <w:p>
+      <w:pPr>
+        <w:spacing w:line="240" w:lineRule="auto"/>
+        <w:rPr>
+          <w:b/>
+          <w:bCs/>
+          <w:sz w:val="32"/>
+          <w:szCs w:val="32"/>
+        </w:rPr>
+      </w:pPr>
+      <w:r>
+        <w:rPr>
+          <w:b/>
+          <w:bCs/>
+          <w:sz w:val="32"/>
+          <w:szCs w:val="32"/>
+        </w:rPr>
+        <w:t xml:space="preserve">     </w:t>
+      </w:r>
+      <w:r>
+        <w:rPr>
+          <w:b/>
+          <w:bCs/>
+          <w:sz w:val="32"/>
+          <w:szCs w:val="32"/>
+        </w:rPr>
+        <w:t xml:space="preserve">step </w:t>
+      </w:r>
+      <w:r>
+        <w:rPr>
+          <w:b/>
+          <w:bCs/>
+          <w:sz w:val="32"/>
+          <w:szCs w:val="32"/>
+        </w:rPr>
+        <w:t>4.</w:t>
+      </w:r>
+      <w:r>
+        <w:rPr>
+          <w:b/>
+          <w:bCs/>
+          <w:sz w:val="32"/>
+          <w:szCs w:val="32"/>
+        </w:rPr>
+        <w:t xml:space="preserve">3: Compare </w:t>
+      </w:r>
+      <w:proofErr w:type="gramStart"/>
+      <w:r>
+        <w:rPr>
+          <w:b/>
+          <w:bCs/>
+          <w:sz w:val="32"/>
+          <w:szCs w:val="32"/>
+        </w:rPr>
+        <w:t>Non Refund</w:t>
+      </w:r>
+      <w:proofErr w:type="gramEnd"/>
+      <w:r>
+        <w:rPr>
+          <w:b/>
+          <w:bCs/>
+          <w:sz w:val="32"/>
+          <w:szCs w:val="32"/>
+        </w:rPr>
+        <w:t xml:space="preserve"> cancellation rate by hotel</w:t>
+      </w:r>
+    </w:p>
+    <w:p>
+      <w:pPr>
+        <w:spacing w:line="240" w:lineRule="auto"/>
+        <w:ind w:left="360"/>
+        <w:rPr>
+          <w:b/>
+          <w:bCs/>
+          <w:sz w:val="32"/>
+          <w:szCs w:val="32"/>
+        </w:rPr>
+      </w:pPr>
+      <w:r>
+        <w:rPr>
+          <w:b/>
+          <w:bCs/>
+          <w:sz w:val="32"/>
+          <w:szCs w:val="32"/>
+        </w:rPr>
+        <w:drawing>
+          <wp:inline distT="0" distB="0" distL="0" distR="0" wp14:anchorId="4BC0DAB5" wp14:editId="40931F9B">
+            <wp:extent cx="5515745" cy="1400370"/>
+            <wp:effectExtent l="0" t="0" r="8890" b="9525"/>
+            <wp:docPr id="808362658" name="Picture 1"/>
+            <wp:cNvGraphicFramePr>
+              <a:graphicFrameLocks xmlns:a="http://schemas.openxmlformats.org/drawingml/2006/main" noChangeAspect="1"/>
+            </wp:cNvGraphicFramePr>
+            <a:graphic xmlns:a="http://schemas.openxmlformats.org/drawingml/2006/main">
+              <a:graphicData uri="http://schemas.openxmlformats.org/drawingml/2006/picture">
+                <pic:pic xmlns:pic="http://schemas.openxmlformats.org/drawingml/2006/picture">
+                  <pic:nvPicPr>
+                    <pic:cNvPr id="808362658" name=""/>
+                    <pic:cNvPicPr/>
+                  </pic:nvPicPr>
+                  <pic:blipFill>
+                    <a:blip r:embed="rId15"/>
+                    <a:stretch>
+                      <a:fillRect/>
+                    </a:stretch>
+                  </pic:blipFill>
+                  <pic:spPr>
+                    <a:xfrm>
+                      <a:off x="0" y="0"/>
+                      <a:ext cx="5515745" cy="1400370"/>
+                    </a:xfrm>
+                    <a:prstGeom prst="rect">
+                      <a:avLst/>
+                    </a:prstGeom>
+                  </pic:spPr>
+                </pic:pic>
+              </a:graphicData>
+            </a:graphic>
+          </wp:inline>
+        </w:drawing>
+      </w:r>
+    </w:p>
+    <w:p>
+      <w:pPr>
+        <w:spacing w:line="240" w:lineRule="auto"/>
+        <w:rPr>
+          <w:b/>
+          <w:bCs/>
+          <w:sz w:val="32"/>
+          <w:szCs w:val="32"/>
+        </w:rPr>
+      </w:pPr>
+      <w:r>
+        <w:rPr>
+          <w:b/>
+          <w:bCs/>
+          <w:sz w:val="32"/>
+          <w:szCs w:val="32"/>
+        </w:rPr>
+        <w:lastRenderedPageBreak/>
+        <w:t xml:space="preserve">step </w:t>
+      </w:r>
+      <w:r>
+        <w:rPr>
+          <w:b/>
+          <w:bCs/>
+          <w:sz w:val="32"/>
+          <w:szCs w:val="32"/>
+        </w:rPr>
+        <w:t>4.</w:t>
+      </w:r>
+      <w:r>
+        <w:rPr>
+          <w:b/>
+          <w:bCs/>
+          <w:sz w:val="32"/>
+          <w:szCs w:val="32"/>
+        </w:rPr>
+        <w:t>4: Check Market Segment</w:t>
+      </w:r>
+    </w:p>
+    <w:p>
+      <w:pPr>
+        <w:spacing w:line="240" w:lineRule="auto"/>
+        <w:ind w:left="360"/>
+        <w:rPr>
+          <w:b/>
+          <w:bCs/>
+          <w:sz w:val="32"/>
+          <w:szCs w:val="32"/>
+        </w:rPr>
+      </w:pPr>
+    </w:p>
+    <w:p>
+      <w:pPr>
+        <w:spacing w:line="240" w:lineRule="auto"/>
+        <w:ind w:left="360"/>
+        <w:rPr>
+          <w:b/>
+          <w:bCs/>
+          <w:sz w:val="40"/>
+          <w:szCs w:val="40"/>
+        </w:rPr>
+      </w:pPr>
+      <w:r>
+        <w:rPr>
+          <w:b/>
+          <w:bCs/>
+          <w:sz w:val="40"/>
+          <w:szCs w:val="40"/>
+        </w:rPr>
+        <w:drawing>
+          <wp:inline distT="0" distB="0" distL="0" distR="0" wp14:anchorId="5ADC47DA" wp14:editId="6A2E7AE0">
+            <wp:extent cx="5731510" cy="2270125"/>
+            <wp:effectExtent l="0" t="0" r="2540" b="0"/>
+            <wp:docPr id="1559749014" name="Picture 1"/>
+            <wp:cNvGraphicFramePr>
+              <a:graphicFrameLocks xmlns:a="http://schemas.openxmlformats.org/drawingml/2006/main" noChangeAspect="1"/>
+            </wp:cNvGraphicFramePr>
+            <a:graphic xmlns:a="http://schemas.openxmlformats.org/drawingml/2006/main">
+              <a:graphicData uri="http://schemas.openxmlformats.org/drawingml/2006/picture">
+                <pic:pic xmlns:pic="http://schemas.openxmlformats.org/drawingml/2006/picture">
+                  <pic:nvPicPr>
+                    <pic:cNvPr id="1559749014" name=""/>
+                    <pic:cNvPicPr/>
+                  </pic:nvPicPr>
+                  <pic:blipFill>
+                    <a:blip r:embed="rId16"/>
+                    <a:stretch>
+                      <a:fillRect/>
+                    </a:stretch>
+                  </pic:blipFill>
+                  <pic:spPr>
+                    <a:xfrm>
+                      <a:off x="0" y="0"/>
+                      <a:ext cx="5731510" cy="2270125"/>
+                    </a:xfrm>
+                    <a:prstGeom prst="rect">
+                      <a:avLst/>
+                    </a:prstGeom>
+                  </pic:spPr>
+                </pic:pic>
+              </a:graphicData>
+            </a:graphic>
+          </wp:inline>
+        </w:drawing>
+      </w:r>
+    </w:p>
+    <w:p>
+      <w:pPr>
+        <w:spacing w:line="240" w:lineRule="auto"/>
+        <w:ind w:left="360"/>
+        <w:rPr>
+          <w:b/>
+          <w:bCs/>
+          <w:sz w:val="32"/>
+          <w:szCs w:val="32"/>
+        </w:rPr>
+      </w:pPr>
+    </w:p>
+    <w:p>
+      <w:pPr>
+        <w:spacing w:line="240" w:lineRule="auto"/>
+        <w:ind w:left="360"/>
+        <w:rPr>
+          <w:b/>
+          <w:bCs/>
+          <w:sz w:val="32"/>
+          <w:szCs w:val="32"/>
+        </w:rPr>
+      </w:pPr>
+      <w:r>
+        <w:rPr>
+          <w:b/>
+          <w:bCs/>
+          <w:sz w:val="32"/>
+          <w:szCs w:val="32"/>
+        </w:rPr>
+        <w:t xml:space="preserve">step </w:t>
+      </w:r>
+      <w:r>
+        <w:rPr>
+          <w:b/>
+          <w:bCs/>
+          <w:sz w:val="32"/>
+          <w:szCs w:val="32"/>
+        </w:rPr>
+        <w:t>4.</w:t>
+      </w:r>
+      <w:r>
+        <w:rPr>
+          <w:b/>
+          <w:bCs/>
+          <w:sz w:val="32"/>
+          <w:szCs w:val="32"/>
+        </w:rPr>
+        <w:t>5: Check Distribution Channel</w:t>
+      </w:r>
+    </w:p>
+    <w:p>
+      <w:pPr>
+        <w:spacing w:line="240" w:lineRule="auto"/>
+        <w:ind w:left="360"/>
+        <w:rPr>
+          <w:b/>
+          <w:bCs/>
+          <w:sz w:val="40"/>
+          <w:szCs w:val="40"/>
+        </w:rPr>
+      </w:pPr>
+    </w:p>
+    <w:p>
+      <w:pPr>
+        <w:spacing w:line="240" w:lineRule="auto"/>
+        <w:ind w:left="360"/>
+        <w:rPr>
+          <w:b/>
+          <w:bCs/>
+          <w:sz w:val="40"/>
+          <w:szCs w:val="40"/>
+        </w:rPr>
+      </w:pPr>
+      <w:r>
+        <w:rPr>
+          <w:b/>
+          <w:bCs/>
+          <w:sz w:val="40"/>
+          <w:szCs w:val="40"/>
+        </w:rPr>
+        <w:drawing>
+          <wp:inline distT="0" distB="0" distL="0" distR="0" wp14:anchorId="71204C20" wp14:editId="39B60FB0">
+            <wp:extent cx="5731510" cy="1612900"/>
+            <wp:effectExtent l="0" t="0" r="2540" b="6350"/>
+            <wp:docPr id="438188388" name="Picture 1"/>
+            <wp:cNvGraphicFramePr>
+              <a:graphicFrameLocks xmlns:a="http://schemas.openxmlformats.org/drawingml/2006/main" noChangeAspect="1"/>
+            </wp:cNvGraphicFramePr>
+            <a:graphic xmlns:a="http://schemas.openxmlformats.org/drawingml/2006/main">
+              <a:graphicData uri="http://schemas.openxmlformats.org/drawingml/2006/picture">
+                <pic:pic xmlns:pic="http://schemas.openxmlformats.org/drawingml/2006/picture">
+                  <pic:nvPicPr>
+                    <pic:cNvPr id="438188388" name=""/>
+                    <pic:cNvPicPr/>
+                  </pic:nvPicPr>
+                  <pic:blipFill>
+                    <a:blip r:embed="rId17"/>
+                    <a:stretch>
+                      <a:fillRect/>
+                    </a:stretch>
+                  </pic:blipFill>
+                  <pic:spPr>
+                    <a:xfrm>
+                      <a:off x="0" y="0"/>
+                      <a:ext cx="5731510" cy="1612900"/>
+                    </a:xfrm>
+                    <a:prstGeom prst="rect">
+                      <a:avLst/>
+                    </a:prstGeom>
+                  </pic:spPr>
+                </pic:pic>
+              </a:graphicData>
+            </a:graphic>
+          </wp:inline>
+        </w:drawing>
+      </w:r>
+    </w:p>
+    <w:p>
+      <w:pPr>
+        <w:spacing w:line="240" w:lineRule="auto"/>
+        <w:ind w:left="360"/>
+        <w:rPr>
+          <w:b/>
+          <w:bCs/>
+          <w:sz w:val="40"/>
+          <w:szCs w:val="40"/>
+        </w:rPr>
+      </w:pPr>
+    </w:p>
+    <w:p>
+      <w:pPr>
+        <w:spacing w:line="240" w:lineRule="auto"/>
+        <w:ind w:left="360"/>
+        <w:rPr>
+          <w:b/>
+          <w:bCs/>
+          <w:sz w:val="32"/>
+          <w:szCs w:val="32"/>
+        </w:rPr>
+      </w:pPr>
+      <w:r>
+        <w:rPr>
+          <w:b/>
+          <w:bCs/>
+          <w:sz w:val="32"/>
+          <w:szCs w:val="32"/>
+        </w:rPr>
+        <w:t>Finding: Non-Refund Bookings Show an Exceptionally High Cancellation Rate</w:t>
+      </w:r>
+    </w:p>
+    <w:p>
+      <w:pPr>
+        <w:spacing w:line="240" w:lineRule="auto"/>
+        <w:ind w:left="360"/>
+      </w:pPr>
+      <w:r>
+        <w:t xml:space="preserve">The investigation confirmed that the unusually high 99.36% cancellation rate for </w:t>
+      </w:r>
+      <w:proofErr w:type="gramStart"/>
+      <w:r>
+        <w:t>Non Refund</w:t>
+      </w:r>
+      <w:proofErr w:type="gramEnd"/>
+      <w:r>
+        <w:t xml:space="preserve"> bookings is a robust pattern rather than a result of a small sample size. There were 14,572 </w:t>
+      </w:r>
+      <w:proofErr w:type="gramStart"/>
+      <w:r>
+        <w:t>Non Refund</w:t>
+      </w:r>
+      <w:proofErr w:type="gramEnd"/>
+      <w:r>
+        <w:t xml:space="preserve"> bookings, of which 14,479 were cancelled, leaving only 93 non-cancelled bookings.</w:t>
+      </w:r>
+    </w:p>
+    <w:p>
+      <w:pPr>
+        <w:spacing w:line="240" w:lineRule="auto"/>
+        <w:ind w:left="360"/>
+      </w:pPr>
+      <w:r>
+        <w:t>The pattern remained consistently high across both hotel types, with cancellation rates of 99.81% for City Hotel and 95.99% for Resort Hotel, indicating that the finding is not specific to one hotel type.</w:t>
+      </w:r>
+    </w:p>
+    <w:p>
+      <w:pPr>
+        <w:spacing w:line="240" w:lineRule="auto"/>
+        <w:ind w:left="360"/>
+      </w:pPr>
+      <w:r>
+        <w:t xml:space="preserve">Further investigation showed that </w:t>
+      </w:r>
+      <w:proofErr w:type="gramStart"/>
+      <w:r>
+        <w:t>Non Refund</w:t>
+      </w:r>
+      <w:proofErr w:type="gramEnd"/>
+      <w:r>
+        <w:t xml:space="preserve"> cancellations were particularly concentrated in the Offline TA/TO and Groups market segments, which recorded </w:t>
+      </w:r>
+      <w:r>
+        <w:lastRenderedPageBreak/>
+        <w:t>cancellation rates of 99.94% and 99.32%, respectively. The distribution-channel analysis showed a similar pattern, with TA/TO bookings recording a 99.61% cancellation rate.</w:t>
+      </w:r>
+    </w:p>
+    <w:p>
+      <w:pPr>
+        <w:spacing w:line="240" w:lineRule="auto"/>
+        <w:ind w:left="360"/>
+      </w:pPr>
+      <w:r>
+        <w:t xml:space="preserve">Overall, the evidence indicates a strong association between </w:t>
+      </w:r>
+      <w:proofErr w:type="gramStart"/>
+      <w:r>
+        <w:t>Non Refund</w:t>
+      </w:r>
+      <w:proofErr w:type="gramEnd"/>
+      <w:r>
+        <w:t xml:space="preserve"> bookings and cancellations, particularly among group and travel-agent/tour-operator bookings. However, this analysis does not establish that the </w:t>
+      </w:r>
+      <w:proofErr w:type="gramStart"/>
+      <w:r>
+        <w:t>Non Refund</w:t>
+      </w:r>
+      <w:proofErr w:type="gramEnd"/>
+      <w:r>
+        <w:t xml:space="preserve"> deposit type itself causes cancellations. The pattern may reflect underlying booking policies, group-booking practices, travel-agent/tour-operator processes, or other factors associated with these booking types.</w:t>
+      </w:r>
+    </w:p>
+    <w:p>
+      <w:pPr>
+        <w:spacing w:line="240" w:lineRule="auto"/>
+        <w:ind w:left="360"/>
+      </w:pPr>
+      <w:r>
+        <w:t xml:space="preserve">This finding is therefore important for hotel management because </w:t>
+      </w:r>
+      <w:proofErr w:type="gramStart"/>
+      <w:r>
+        <w:t>Non Refund</w:t>
+      </w:r>
+      <w:proofErr w:type="gramEnd"/>
+      <w:r>
+        <w:t xml:space="preserve"> bookings represent a high-risk cancellation segment and warrant further investigation into booking policies, contract terms, and channel-specific practices.</w:t>
+      </w:r>
     </w:p>
     <w:p>
       <w:pPr>
@@ -3515,7 +4283,6 @@
     <w:next w:val="Normal"/>
     <w:link w:val="Heading4Char"/>
     <w:uiPriority w:val="9"/>
-    <w:semiHidden/>
     <w:unhideWhenUsed/>
     <w:qFormat/>
     <w:rsid w:val="009A587D"/>
@@ -3713,7 +4480,6 @@
     <w:basedOn w:val="DefaultParagraphFont"/>
     <w:link w:val="Heading4"/>
     <w:uiPriority w:val="9"/>
-    <w:semiHidden/>
     <w:rsid w:val="009A587D"/>
     <w:rPr>
       <w:rFonts w:eastAsiaTheme="majorEastAsia" w:cstheme="majorBidi"/>

</xml_diff>

<commit_message>
create barh for cancellation rate by hotel
</commit_message>
<xml_diff>
--- a/Report/Report.docx
+++ b/Report/Report.docx
@@ -180,15 +180,7 @@
         <w:spacing w:after="0" w:line="276" w:lineRule="auto"/>
       </w:pPr>
       <w:r>
-        <w:t xml:space="preserve">The information is still current and can be used to </w:t>
-      </w:r>
-      <w:proofErr w:type="spellStart"/>
-      <w:r>
-        <w:t>analyze</w:t>
-      </w:r>
-      <w:proofErr w:type="spellEnd"/>
-      <w:r>
-        <w:t xml:space="preserve"> a hotel's possible plans in</w:t>
+        <w:t>The information is still current and can be used to analyze a hotel's possible plans in</w:t>
       </w:r>
     </w:p>
     <w:p>
@@ -405,6 +397,15 @@
       <w:r>
         <w:t>How does cancellation rate vary by deposit type?</w:t>
       </w:r>
+      <w:r>
+        <w:t xml:space="preserve"> </w:t>
+      </w:r>
+      <w:r>
+        <w:rPr>
+          <w:rFonts w:ascii="Segoe UI Emoji" w:hAnsi="Segoe UI Emoji" w:cs="Segoe UI Emoji"/>
+        </w:rPr>
+        <w:t>✅</w:t>
+      </w:r>
     </w:p>
     <w:p>
       <w:pPr>
@@ -418,6 +419,15 @@
       <w:r>
         <w:t>Which booking channels and market segments have the highest cancellation rates?</w:t>
       </w:r>
+      <w:r>
+        <w:t xml:space="preserve"> </w:t>
+      </w:r>
+      <w:r>
+        <w:rPr>
+          <w:rFonts w:ascii="Segoe UI Emoji" w:hAnsi="Segoe UI Emoji" w:cs="Segoe UI Emoji"/>
+        </w:rPr>
+        <w:t>✅</w:t>
+      </w:r>
     </w:p>
     <w:p>
       <w:pPr>
@@ -555,15 +565,13 @@
         <w:spacing w:line="240" w:lineRule="auto"/>
       </w:pPr>
       <w:r>
-        <w:t xml:space="preserve">Customer characteristics and previous booking </w:t>
-      </w:r>
-      <w:proofErr w:type="spellStart"/>
-      <w:r>
-        <w:t>behavior</w:t>
-      </w:r>
-      <w:proofErr w:type="spellEnd"/>
-      <w:r>
-        <w:t xml:space="preserve"> are associated with cancellation rates.</w:t>
+        <w:t>Customer characteristics and previous booking behavio</w:t>
+      </w:r>
+      <w:r>
+        <w:t>u</w:t>
+      </w:r>
+      <w:r>
+        <w:t>r are associated with cancellation rates.</w:t>
       </w:r>
     </w:p>
     <w:p>
@@ -944,16 +952,15 @@
         <w:rPr>
           <w:b/>
           <w:bCs/>
-          <w:noProof/>
           <w:sz w:val="40"/>
           <w:szCs w:val="40"/>
         </w:rPr>
         <w:lastRenderedPageBreak/>
         <w:drawing>
-          <wp:inline distT="0" distB="0" distL="0" distR="0" wp14:anchorId="586CAD9D" wp14:editId="150074E8">
-            <wp:extent cx="4593446" cy="3776133"/>
-            <wp:effectExtent l="0" t="0" r="0" b="0"/>
-            <wp:docPr id="1146167576" name="Picture 1"/>
+          <wp:inline distT="0" distB="0" distL="0" distR="0" wp14:anchorId="1F9A0B0D" wp14:editId="1510BF00">
+            <wp:extent cx="5731510" cy="3288030"/>
+            <wp:effectExtent l="0" t="0" r="2540" b="7620"/>
+            <wp:docPr id="803799081" name="Picture 1"/>
             <wp:cNvGraphicFramePr>
               <a:graphicFrameLocks xmlns:a="http://schemas.openxmlformats.org/drawingml/2006/main" noChangeAspect="1"/>
             </wp:cNvGraphicFramePr>
@@ -961,7 +968,7 @@
               <a:graphicData uri="http://schemas.openxmlformats.org/drawingml/2006/picture">
                 <pic:pic xmlns:pic="http://schemas.openxmlformats.org/drawingml/2006/picture">
                   <pic:nvPicPr>
-                    <pic:cNvPr id="1146167576" name=""/>
+                    <pic:cNvPr id="803799081" name=""/>
                     <pic:cNvPicPr/>
                   </pic:nvPicPr>
                   <pic:blipFill>
@@ -973,7 +980,7 @@
                   <pic:spPr>
                     <a:xfrm>
                       <a:off x="0" y="0"/>
-                      <a:ext cx="4608697" cy="3788670"/>
+                      <a:ext cx="5731510" cy="3288030"/>
                     </a:xfrm>
                     <a:prstGeom prst="rect">
                       <a:avLst/>
@@ -1077,18 +1084,10 @@
         <w:t xml:space="preserve">% for </w:t>
       </w:r>
       <w:r>
-        <w:t xml:space="preserve">Resort </w:t>
-      </w:r>
-      <w:proofErr w:type="gramStart"/>
-      <w:r>
-        <w:t xml:space="preserve">hotel </w:t>
-      </w:r>
-      <w:r>
-        <w:t>,</w:t>
-      </w:r>
-      <w:proofErr w:type="gramEnd"/>
-      <w:r>
-        <w:t xml:space="preserve"> a difference of </w:t>
+        <w:t xml:space="preserve">Resort hotel </w:t>
+      </w:r>
+      <w:r>
+        <w:t xml:space="preserve">, a difference of </w:t>
       </w:r>
       <w:r>
         <w:t>13.73</w:t>
@@ -1217,7 +1216,6 @@
           <w:sz w:val="40"/>
           <w:szCs w:val="40"/>
         </w:rPr>
-        <w:lastRenderedPageBreak/>
         <w:drawing>
           <wp:inline distT="0" distB="0" distL="0" distR="0" wp14:anchorId="69AA62DC" wp14:editId="489F89A8">
             <wp:extent cx="2581635" cy="1752845"/>
@@ -1273,6 +1271,7 @@
           <w:sz w:val="40"/>
           <w:szCs w:val="40"/>
         </w:rPr>
+        <w:lastRenderedPageBreak/>
         <w:drawing>
           <wp:inline distT="0" distB="0" distL="0" distR="0" wp14:anchorId="0A760F56" wp14:editId="64DF4E57">
             <wp:extent cx="5731510" cy="3148330"/>
@@ -1530,67 +1529,67 @@
         <w:spacing w:line="240" w:lineRule="auto"/>
       </w:pPr>
       <w:r>
+        <w:t>From a business perspective, hotels should pay particular attention to long-lead bookings because they represent a higher cancellation-risk segment. However, this analysis identifies an association rather than proving that longer lead time directly causes cancellations.</w:t>
+      </w:r>
+    </w:p>
+    <w:p>
+      <w:pPr>
+        <w:spacing w:line="240" w:lineRule="auto"/>
+        <w:rPr>
+          <w:b/>
+          <w:bCs/>
+          <w:sz w:val="32"/>
+          <w:szCs w:val="32"/>
+        </w:rPr>
+      </w:pPr>
+      <w:r>
+        <w:rPr>
+          <w:b/>
+          <w:bCs/>
+          <w:sz w:val="32"/>
+          <w:szCs w:val="32"/>
+        </w:rPr>
+        <w:t>Business Recommendation from This Finding</w:t>
+      </w:r>
+    </w:p>
+    <w:p>
+      <w:pPr>
+        <w:spacing w:line="240" w:lineRule="auto"/>
+      </w:pPr>
+      <w:r>
+        <w:t>This finding connects directly to your second business question:</w:t>
+      </w:r>
+    </w:p>
+    <w:p>
+      <w:pPr>
+        <w:spacing w:line="240" w:lineRule="auto"/>
+      </w:pPr>
+      <w:r>
+        <w:t>How can hotels reduce booking cancellations and improve room occupancy and revenue?</w:t>
+      </w:r>
+    </w:p>
+    <w:p>
+      <w:pPr>
+        <w:spacing w:line="240" w:lineRule="auto"/>
+      </w:pPr>
+      <w:r>
+        <w:t>A reasonable recommendation is:</w:t>
+      </w:r>
+    </w:p>
+    <w:p>
+      <w:pPr>
+        <w:spacing w:line="240" w:lineRule="auto"/>
+      </w:pPr>
+      <w:r>
+        <w:t>Hotels should monitor long-lead bookings more closely and use appropriate cancellation-management strategies for these reservations.</w:t>
+      </w:r>
+    </w:p>
+    <w:p>
+      <w:pPr>
+        <w:spacing w:line="240" w:lineRule="auto"/>
+      </w:pPr>
+      <w:r>
         <w:lastRenderedPageBreak/>
-        <w:t>From a business perspective, hotels should pay particular attention to long-lead bookings because they represent a higher cancellation-risk segment. However, this analysis identifies an association rather than proving that longer lead time directly causes cancellations.</w:t>
-      </w:r>
-    </w:p>
-    <w:p>
-      <w:pPr>
-        <w:spacing w:line="240" w:lineRule="auto"/>
-        <w:rPr>
-          <w:b/>
-          <w:bCs/>
-          <w:sz w:val="32"/>
-          <w:szCs w:val="32"/>
-        </w:rPr>
-      </w:pPr>
-      <w:r>
-        <w:rPr>
-          <w:b/>
-          <w:bCs/>
-          <w:sz w:val="32"/>
-          <w:szCs w:val="32"/>
-        </w:rPr>
-        <w:t>Business Recommendation from This Finding</w:t>
-      </w:r>
-    </w:p>
-    <w:p>
-      <w:pPr>
-        <w:spacing w:line="240" w:lineRule="auto"/>
-      </w:pPr>
-      <w:r>
-        <w:t>This finding connects directly to your second business question:</w:t>
-      </w:r>
-    </w:p>
-    <w:p>
-      <w:pPr>
-        <w:spacing w:line="240" w:lineRule="auto"/>
-      </w:pPr>
-      <w:r>
-        <w:t>How can hotels reduce booking cancellations and improve room occupancy and revenue?</w:t>
-      </w:r>
-    </w:p>
-    <w:p>
-      <w:pPr>
-        <w:spacing w:line="240" w:lineRule="auto"/>
-      </w:pPr>
-      <w:r>
-        <w:t>A reasonable recommendation is:</w:t>
-      </w:r>
-    </w:p>
-    <w:p>
-      <w:pPr>
-        <w:spacing w:line="240" w:lineRule="auto"/>
-      </w:pPr>
-      <w:r>
-        <w:t>Hotels should monitor long-lead bookings more closely and use appropriate cancellation-management strategies for these reservations.</w:t>
-      </w:r>
-    </w:p>
-    <w:p>
-      <w:pPr>
-        <w:spacing w:line="240" w:lineRule="auto"/>
-      </w:pPr>
-      <w:r>
         <w:t>For example, hotels could consider:</w:t>
       </w:r>
     </w:p>
@@ -1927,15 +1926,7 @@
         <w:t>22.22% for Refundable</w:t>
       </w:r>
       <w:r>
-        <w:t xml:space="preserve"> bookings. The </w:t>
-      </w:r>
-      <w:proofErr w:type="gramStart"/>
-      <w:r>
-        <w:t>Non Refund</w:t>
-      </w:r>
-      <w:proofErr w:type="gramEnd"/>
-      <w:r>
-        <w:t xml:space="preserve"> category therefore stands out as the deposit type most strongly associated with cancellations.</w:t>
+        <w:t xml:space="preserve"> bookings. The Non Refund category therefore stands out as the deposit type most strongly associated with cancellations.</w:t>
       </w:r>
     </w:p>
     <w:p>
@@ -1983,38 +1974,12 @@
     </w:p>
     <w:p>
       <w:r>
-        <w:t xml:space="preserve">Deposit type appears to be an important factor associated with booking cancellations. The extremely high cancellation rate among </w:t>
-      </w:r>
-      <w:proofErr w:type="spellStart"/>
-      <w:proofErr w:type="gramStart"/>
-      <w:r>
-        <w:t>Non Refund</w:t>
-      </w:r>
-      <w:proofErr w:type="spellEnd"/>
-      <w:proofErr w:type="gramEnd"/>
-      <w:r>
-        <w:t xml:space="preserve"> bookings </w:t>
-      </w:r>
-      <w:proofErr w:type="gramStart"/>
-      <w:r>
-        <w:t>suggests</w:t>
-      </w:r>
-      <w:proofErr w:type="gramEnd"/>
-      <w:r>
-        <w:t xml:space="preserve"> that this booking category requires further investigation.</w:t>
-      </w:r>
-    </w:p>
-    <w:p>
-      <w:r>
-        <w:t xml:space="preserve">Hotels should examine the characteristics of </w:t>
-      </w:r>
-      <w:proofErr w:type="gramStart"/>
-      <w:r>
-        <w:t>Non Refund</w:t>
-      </w:r>
-      <w:proofErr w:type="gramEnd"/>
-      <w:r>
-        <w:t xml:space="preserve"> bookings, such as </w:t>
+        <w:t>Deposit type appears to be an important factor associated with booking cancellations. The extremely high cancellation rate among Non Refund bookings suggests that this booking category requires further investigation.</w:t>
+      </w:r>
+    </w:p>
+    <w:p>
+      <w:r>
+        <w:t xml:space="preserve">Hotels should examine the characteristics of Non Refund bookings, such as </w:t>
       </w:r>
       <w:r>
         <w:rPr>
@@ -2051,7 +2016,6 @@
         <w:lastRenderedPageBreak/>
         <w:t xml:space="preserve">Investigate the </w:t>
       </w:r>
-      <w:proofErr w:type="gramStart"/>
       <w:r>
         <w:rPr>
           <w:b/>
@@ -2059,17 +2023,8 @@
         </w:rPr>
         <w:t>Non Refund</w:t>
       </w:r>
-      <w:proofErr w:type="gramEnd"/>
-      <w:r>
-        <w:t xml:space="preserve"> booking category to understand why its cancellation rate is exceptionally high. </w:t>
-      </w:r>
-      <w:proofErr w:type="spellStart"/>
-      <w:r>
-        <w:t>Analyze</w:t>
-      </w:r>
-      <w:proofErr w:type="spellEnd"/>
-      <w:r>
-        <w:t xml:space="preserve"> its relationship with </w:t>
+      <w:r>
+        <w:t xml:space="preserve"> booking category to understand why its cancellation rate is exceptionally high. Analyze its relationship with </w:t>
       </w:r>
       <w:r>
         <w:rPr>
@@ -2114,9 +2069,8 @@
           <w:sz w:val="36"/>
           <w:szCs w:val="36"/>
         </w:rPr>
-        <w:t xml:space="preserve">Step </w:t>
-      </w:r>
-      <w:proofErr w:type="gramStart"/>
+        <w:t xml:space="preserve">Step 4.1 : </w:t>
+      </w:r>
       <w:r>
         <w:rPr>
           <w:b/>
@@ -2124,46 +2078,7 @@
           <w:sz w:val="36"/>
           <w:szCs w:val="36"/>
         </w:rPr>
-        <w:t>4.1 :</w:t>
-      </w:r>
-      <w:proofErr w:type="gramEnd"/>
-      <w:r>
-        <w:rPr>
-          <w:b/>
-          <w:bCs/>
-          <w:sz w:val="36"/>
-          <w:szCs w:val="36"/>
-        </w:rPr>
-        <w:t xml:space="preserve"> </w:t>
-      </w:r>
-      <w:r>
-        <w:rPr>
-          <w:b/>
-          <w:bCs/>
-          <w:sz w:val="36"/>
-          <w:szCs w:val="36"/>
-        </w:rPr>
-        <w:t xml:space="preserve">Investigate the unusual high </w:t>
-      </w:r>
-      <w:proofErr w:type="gramStart"/>
-      <w:r>
-        <w:rPr>
-          <w:b/>
-          <w:bCs/>
-          <w:sz w:val="36"/>
-          <w:szCs w:val="36"/>
-        </w:rPr>
-        <w:t>Non Refund</w:t>
-      </w:r>
-      <w:proofErr w:type="gramEnd"/>
-      <w:r>
-        <w:rPr>
-          <w:b/>
-          <w:bCs/>
-          <w:sz w:val="36"/>
-          <w:szCs w:val="36"/>
-        </w:rPr>
-        <w:t xml:space="preserve"> cancellation rate</w:t>
+        <w:t>Investigate the unusual high Non Refund cancellation rate</w:t>
       </w:r>
     </w:p>
     <w:p>
@@ -2186,7 +2101,6 @@
         </w:rPr>
         <w:t xml:space="preserve">step </w:t>
       </w:r>
-      <w:proofErr w:type="gramStart"/>
       <w:r>
         <w:rPr>
           <w:b/>
@@ -2203,17 +2117,7 @@
           <w:sz w:val="32"/>
           <w:szCs w:val="32"/>
         </w:rPr>
-        <w:t>1 :</w:t>
-      </w:r>
-      <w:proofErr w:type="gramEnd"/>
-      <w:r>
-        <w:rPr>
-          <w:b/>
-          <w:bCs/>
-          <w:sz w:val="32"/>
-          <w:szCs w:val="32"/>
-        </w:rPr>
-        <w:t xml:space="preserve"> Check the sample size</w:t>
+        <w:t>1 : Check the sample size</w:t>
       </w:r>
     </w:p>
     <w:p>
@@ -2331,27 +2235,7 @@
           <w:sz w:val="32"/>
           <w:szCs w:val="32"/>
         </w:rPr>
-        <w:t xml:space="preserve">2: Look directly at the </w:t>
-      </w:r>
-      <w:proofErr w:type="gramStart"/>
-      <w:r>
-        <w:rPr>
-          <w:b/>
-          <w:bCs/>
-          <w:sz w:val="32"/>
-          <w:szCs w:val="32"/>
-        </w:rPr>
-        <w:t>Non Refund</w:t>
-      </w:r>
-      <w:proofErr w:type="gramEnd"/>
-      <w:r>
-        <w:rPr>
-          <w:b/>
-          <w:bCs/>
-          <w:sz w:val="32"/>
-          <w:szCs w:val="32"/>
-        </w:rPr>
-        <w:t xml:space="preserve"> bookings</w:t>
+        <w:t>2: Look directly at the Non Refund bookings</w:t>
       </w:r>
     </w:p>
     <w:p>
@@ -2453,27 +2337,7 @@
           <w:sz w:val="32"/>
           <w:szCs w:val="32"/>
         </w:rPr>
-        <w:t xml:space="preserve">3: Compare </w:t>
-      </w:r>
-      <w:proofErr w:type="gramStart"/>
-      <w:r>
-        <w:rPr>
-          <w:b/>
-          <w:bCs/>
-          <w:sz w:val="32"/>
-          <w:szCs w:val="32"/>
-        </w:rPr>
-        <w:t>Non Refund</w:t>
-      </w:r>
-      <w:proofErr w:type="gramEnd"/>
-      <w:r>
-        <w:rPr>
-          <w:b/>
-          <w:bCs/>
-          <w:sz w:val="32"/>
-          <w:szCs w:val="32"/>
-        </w:rPr>
-        <w:t xml:space="preserve"> cancellation rate by hotel</w:t>
+        <w:t>3: Compare Non Refund cancellation rate by hotel</w:t>
       </w:r>
     </w:p>
     <w:p>
@@ -2794,23 +2658,7 @@
         <w:ind w:left="360"/>
       </w:pPr>
       <w:r>
-        <w:t xml:space="preserve">The investigation confirmed that the unusually high 99.36% cancellation rate for </w:t>
-      </w:r>
-      <w:proofErr w:type="gramStart"/>
-      <w:r>
-        <w:t>Non Refund</w:t>
-      </w:r>
-      <w:proofErr w:type="gramEnd"/>
-      <w:r>
-        <w:t xml:space="preserve"> bookings is a robust pattern rather than a result of a small sample size. There were 14,572 </w:t>
-      </w:r>
-      <w:proofErr w:type="gramStart"/>
-      <w:r>
-        <w:t>Non Refund</w:t>
-      </w:r>
-      <w:proofErr w:type="gramEnd"/>
-      <w:r>
-        <w:t xml:space="preserve"> bookings, of which 14,479 were cancelled, leaving only 93 non-cancelled bookings.</w:t>
+        <w:t>The investigation confirmed that the unusually high 99.36% cancellation rate for Non Refund bookings is a robust pattern rather than a result of a small sample size. There were 14,572 Non Refund bookings, of which 14,479 were cancelled, leaving only 93 non-cancelled bookings.</w:t>
       </w:r>
     </w:p>
     <w:p>
@@ -2828,15 +2676,7 @@
         <w:ind w:left="360"/>
       </w:pPr>
       <w:r>
-        <w:t xml:space="preserve">Further investigation showed that </w:t>
-      </w:r>
-      <w:proofErr w:type="gramStart"/>
-      <w:r>
-        <w:t>Non Refund</w:t>
-      </w:r>
-      <w:proofErr w:type="gramEnd"/>
-      <w:r>
-        <w:t xml:space="preserve"> cancellations were particularly concentrated in the Offline TA/TO and Groups market segments, which recorded </w:t>
+        <w:t xml:space="preserve">Further investigation showed that Non Refund cancellations were particularly concentrated in the Offline TA/TO and Groups market segments, which recorded </w:t>
       </w:r>
       <w:r>
         <w:lastRenderedPageBreak/>
@@ -2849,23 +2689,7 @@
         <w:ind w:left="360"/>
       </w:pPr>
       <w:r>
-        <w:t xml:space="preserve">Overall, the evidence indicates a strong association between </w:t>
-      </w:r>
-      <w:proofErr w:type="gramStart"/>
-      <w:r>
-        <w:t>Non Refund</w:t>
-      </w:r>
-      <w:proofErr w:type="gramEnd"/>
-      <w:r>
-        <w:t xml:space="preserve"> bookings and cancellations, particularly among group and travel-agent/tour-operator bookings. However, this analysis does not establish that the </w:t>
-      </w:r>
-      <w:proofErr w:type="gramStart"/>
-      <w:r>
-        <w:t>Non Refund</w:t>
-      </w:r>
-      <w:proofErr w:type="gramEnd"/>
-      <w:r>
-        <w:t xml:space="preserve"> deposit type itself causes cancellations. The pattern may reflect underlying booking policies, group-booking practices, travel-agent/tour-operator processes, or other factors associated with these booking types.</w:t>
+        <w:t>Overall, the evidence indicates a strong association between Non Refund bookings and cancellations, particularly among group and travel-agent/tour-operator bookings. However, this analysis does not establish that the Non Refund deposit type itself causes cancellations. The pattern may reflect underlying booking policies, group-booking practices, travel-agent/tour-operator processes, or other factors associated with these booking types.</w:t>
       </w:r>
     </w:p>
     <w:p>
@@ -2874,15 +2698,7 @@
         <w:ind w:left="360"/>
       </w:pPr>
       <w:r>
-        <w:t xml:space="preserve">This finding is therefore important for hotel management because </w:t>
-      </w:r>
-      <w:proofErr w:type="gramStart"/>
-      <w:r>
-        <w:t>Non Refund</w:t>
-      </w:r>
-      <w:proofErr w:type="gramEnd"/>
-      <w:r>
-        <w:t xml:space="preserve"> bookings represent a high-risk cancellation segment and warrant further investigation into booking policies, contract terms, and channel-specific practices.</w:t>
+        <w:t>This finding is therefore important for hotel management because Non Refund bookings represent a high-risk cancellation segment and warrant further investigation into booking policies, contract terms, and channel-specific practices.</w:t>
       </w:r>
     </w:p>
     <w:p>

</xml_diff>

<commit_message>
adding color theme charts to the report
</commit_message>
<xml_diff>
--- a/Report/Report.docx
+++ b/Report/Report.docx
@@ -683,15 +683,11 @@
         <w:spacing w:line="240" w:lineRule="auto"/>
       </w:pPr>
       <w:r>
-        <w:rPr>
-          <w:noProof/>
-        </w:rPr>
-        <w:lastRenderedPageBreak/>
         <w:drawing>
-          <wp:inline distT="0" distB="0" distL="0" distR="0" wp14:anchorId="77166F80" wp14:editId="11D725F4">
-            <wp:extent cx="5418667" cy="3917817"/>
-            <wp:effectExtent l="0" t="0" r="0" b="6985"/>
-            <wp:docPr id="1941196275" name="Picture 1"/>
+          <wp:inline distT="0" distB="0" distL="0" distR="0" wp14:anchorId="331F101E" wp14:editId="69EF97C8">
+            <wp:extent cx="4361699" cy="3268133"/>
+            <wp:effectExtent l="0" t="0" r="1270" b="8890"/>
+            <wp:docPr id="1895723636" name="Picture 1"/>
             <wp:cNvGraphicFramePr>
               <a:graphicFrameLocks xmlns:a="http://schemas.openxmlformats.org/drawingml/2006/main" noChangeAspect="1"/>
             </wp:cNvGraphicFramePr>
@@ -699,7 +695,7 @@
               <a:graphicData uri="http://schemas.openxmlformats.org/drawingml/2006/picture">
                 <pic:pic xmlns:pic="http://schemas.openxmlformats.org/drawingml/2006/picture">
                   <pic:nvPicPr>
-                    <pic:cNvPr id="1941196275" name=""/>
+                    <pic:cNvPr id="1895723636" name=""/>
                     <pic:cNvPicPr/>
                   </pic:nvPicPr>
                   <pic:blipFill>
@@ -711,7 +707,7 @@
                   <pic:spPr>
                     <a:xfrm>
                       <a:off x="0" y="0"/>
-                      <a:ext cx="5441369" cy="3934231"/>
+                      <a:ext cx="4384290" cy="3285060"/>
                     </a:xfrm>
                     <a:prstGeom prst="rect">
                       <a:avLst/>
@@ -723,6 +719,11 @@
           </wp:inline>
         </w:drawing>
       </w:r>
+    </w:p>
+    <w:p>
+      <w:pPr>
+        <w:spacing w:line="240" w:lineRule="auto"/>
+      </w:pPr>
     </w:p>
     <w:p>
       <w:pPr>
@@ -955,12 +956,11 @@
           <w:sz w:val="40"/>
           <w:szCs w:val="40"/>
         </w:rPr>
-        <w:lastRenderedPageBreak/>
         <w:drawing>
-          <wp:inline distT="0" distB="0" distL="0" distR="0" wp14:anchorId="1F9A0B0D" wp14:editId="1510BF00">
-            <wp:extent cx="5731510" cy="3288030"/>
-            <wp:effectExtent l="0" t="0" r="2540" b="7620"/>
-            <wp:docPr id="803799081" name="Picture 1"/>
+          <wp:inline distT="0" distB="0" distL="0" distR="0" wp14:anchorId="272ABFC1" wp14:editId="2E0B0A4F">
+            <wp:extent cx="5582429" cy="3429479"/>
+            <wp:effectExtent l="0" t="0" r="0" b="0"/>
+            <wp:docPr id="617750950" name="Picture 1"/>
             <wp:cNvGraphicFramePr>
               <a:graphicFrameLocks xmlns:a="http://schemas.openxmlformats.org/drawingml/2006/main" noChangeAspect="1"/>
             </wp:cNvGraphicFramePr>
@@ -968,7 +968,7 @@
               <a:graphicData uri="http://schemas.openxmlformats.org/drawingml/2006/picture">
                 <pic:pic xmlns:pic="http://schemas.openxmlformats.org/drawingml/2006/picture">
                   <pic:nvPicPr>
-                    <pic:cNvPr id="803799081" name=""/>
+                    <pic:cNvPr id="617750950" name=""/>
                     <pic:cNvPicPr/>
                   </pic:nvPicPr>
                   <pic:blipFill>
@@ -980,7 +980,7 @@
                   <pic:spPr>
                     <a:xfrm>
                       <a:off x="0" y="0"/>
-                      <a:ext cx="5731510" cy="3288030"/>
+                      <a:ext cx="5582429" cy="3429479"/>
                     </a:xfrm>
                     <a:prstGeom prst="rect">
                       <a:avLst/>
@@ -1010,6 +1010,7 @@
           <w:sz w:val="32"/>
           <w:szCs w:val="32"/>
         </w:rPr>
+        <w:lastRenderedPageBreak/>
         <w:t>Finding</w:t>
       </w:r>
     </w:p>
@@ -1271,7 +1272,6 @@
           <w:sz w:val="40"/>
           <w:szCs w:val="40"/>
         </w:rPr>
-        <w:lastRenderedPageBreak/>
         <w:drawing>
           <wp:inline distT="0" distB="0" distL="0" distR="0" wp14:anchorId="0A760F56" wp14:editId="64DF4E57">
             <wp:extent cx="5731510" cy="3148330"/>
@@ -1335,6 +1335,7 @@
           <w:sz w:val="32"/>
           <w:szCs w:val="32"/>
         </w:rPr>
+        <w:lastRenderedPageBreak/>
         <w:t>Finding</w:t>
       </w:r>
       <w:r>
@@ -1589,7 +1590,6 @@
         <w:spacing w:line="240" w:lineRule="auto"/>
       </w:pPr>
       <w:r>
-        <w:lastRenderedPageBreak/>
         <w:t>For example, hotels could consider:</w:t>
       </w:r>
     </w:p>
@@ -1812,7 +1812,6 @@
           <w:sz w:val="40"/>
           <w:szCs w:val="40"/>
         </w:rPr>
-        <w:lastRenderedPageBreak/>
         <w:drawing>
           <wp:inline distT="0" distB="0" distL="0" distR="0" wp14:anchorId="59E8D490" wp14:editId="0428D2B0">
             <wp:extent cx="6054190" cy="3657600"/>
@@ -1974,6 +1973,7 @@
     </w:p>
     <w:p>
       <w:r>
+        <w:lastRenderedPageBreak/>
         <w:t>Deposit type appears to be an important factor associated with booking cancellations. The extremely high cancellation rate among Non Refund bookings suggests that this booking category requires further investigation.</w:t>
       </w:r>
     </w:p>
@@ -2013,7 +2013,6 @@
     </w:p>
     <w:p>
       <w:r>
-        <w:lastRenderedPageBreak/>
         <w:t xml:space="preserve">Investigate the </w:t>
       </w:r>
       <w:r>
@@ -2310,6 +2309,7 @@
           <w:sz w:val="32"/>
           <w:szCs w:val="32"/>
         </w:rPr>
+        <w:lastRenderedPageBreak/>
         <w:t xml:space="preserve">     </w:t>
       </w:r>
       <w:r>
@@ -2412,7 +2412,6 @@
           <w:sz w:val="32"/>
           <w:szCs w:val="32"/>
         </w:rPr>
-        <w:lastRenderedPageBreak/>
         <w:t xml:space="preserve">step </w:t>
       </w:r>
       <w:r>
@@ -2658,6 +2657,7 @@
         <w:ind w:left="360"/>
       </w:pPr>
       <w:r>
+        <w:lastRenderedPageBreak/>
         <w:t>The investigation confirmed that the unusually high 99.36% cancellation rate for Non Refund bookings is a robust pattern rather than a result of a small sample size. There were 14,572 Non Refund bookings, of which 14,479 were cancelled, leaving only 93 non-cancelled bookings.</w:t>
       </w:r>
     </w:p>
@@ -2676,11 +2676,7 @@
         <w:ind w:left="360"/>
       </w:pPr>
       <w:r>
-        <w:t xml:space="preserve">Further investigation showed that Non Refund cancellations were particularly concentrated in the Offline TA/TO and Groups market segments, which recorded </w:t>
-      </w:r>
-      <w:r>
-        <w:lastRenderedPageBreak/>
-        <w:t>cancellation rates of 99.94% and 99.32%, respectively. The distribution-channel analysis showed a similar pattern, with TA/TO bookings recording a 99.61% cancellation rate.</w:t>
+        <w:t>Further investigation showed that Non Refund cancellations were particularly concentrated in the Offline TA/TO and Groups market segments, which recorded cancellation rates of 99.94% and 99.32%, respectively. The distribution-channel analysis showed a similar pattern, with TA/TO bookings recording a 99.61% cancellation rate.</w:t>
       </w:r>
     </w:p>
     <w:p>

</xml_diff>

<commit_message>
add theme color chart in the report p2
</commit_message>
<xml_diff>
--- a/Report/Report.docx
+++ b/Report/Report.docx
@@ -180,7 +180,15 @@
         <w:spacing w:after="0" w:line="276" w:lineRule="auto"/>
       </w:pPr>
       <w:r>
-        <w:t>The information is still current and can be used to analyze a hotel's possible plans in</w:t>
+        <w:t xml:space="preserve">The information is still current and can be used to </w:t>
+      </w:r>
+      <w:proofErr w:type="spellStart"/>
+      <w:r>
+        <w:t>analyze</w:t>
+      </w:r>
+      <w:proofErr w:type="spellEnd"/>
+      <w:r>
+        <w:t xml:space="preserve"> a hotel's possible plans in</w:t>
       </w:r>
     </w:p>
     <w:p>
@@ -1085,10 +1093,18 @@
         <w:t xml:space="preserve">% for </w:t>
       </w:r>
       <w:r>
-        <w:t xml:space="preserve">Resort hotel </w:t>
-      </w:r>
-      <w:r>
-        <w:t xml:space="preserve">, a difference of </w:t>
+        <w:t xml:space="preserve">Resort </w:t>
+      </w:r>
+      <w:proofErr w:type="gramStart"/>
+      <w:r>
+        <w:t xml:space="preserve">hotel </w:t>
+      </w:r>
+      <w:r>
+        <w:t>,</w:t>
+      </w:r>
+      <w:proofErr w:type="gramEnd"/>
+      <w:r>
+        <w:t xml:space="preserve"> a difference of </w:t>
       </w:r>
       <w:r>
         <w:t>13.73</w:t>
@@ -1253,30 +1269,24 @@
           </wp:inline>
         </w:drawing>
       </w:r>
-    </w:p>
-    <w:p>
-      <w:pPr>
-        <w:spacing w:line="240" w:lineRule="auto"/>
+      <w:r>
+        <w:rPr>
+          <w:noProof/>
+        </w:rPr>
+        <w:t xml:space="preserve"> </w:t>
+      </w:r>
+      <w:r>
         <w:rPr>
           <w:b/>
           <w:bCs/>
           <w:sz w:val="40"/>
           <w:szCs w:val="40"/>
         </w:rPr>
-      </w:pPr>
-      <w:r>
-        <w:rPr>
-          <w:b/>
-          <w:bCs/>
-          <w:noProof/>
-          <w:sz w:val="40"/>
-          <w:szCs w:val="40"/>
-        </w:rPr>
         <w:drawing>
-          <wp:inline distT="0" distB="0" distL="0" distR="0" wp14:anchorId="0A760F56" wp14:editId="64DF4E57">
-            <wp:extent cx="5731510" cy="3148330"/>
-            <wp:effectExtent l="0" t="0" r="2540" b="0"/>
-            <wp:docPr id="1449425618" name="Picture 1"/>
+          <wp:inline distT="0" distB="0" distL="0" distR="0" wp14:anchorId="27C69015" wp14:editId="323F07A7">
+            <wp:extent cx="5731510" cy="3179445"/>
+            <wp:effectExtent l="0" t="0" r="2540" b="1905"/>
+            <wp:docPr id="1635772810" name="Picture 1"/>
             <wp:cNvGraphicFramePr>
               <a:graphicFrameLocks xmlns:a="http://schemas.openxmlformats.org/drawingml/2006/main" noChangeAspect="1"/>
             </wp:cNvGraphicFramePr>
@@ -1284,7 +1294,7 @@
               <a:graphicData uri="http://schemas.openxmlformats.org/drawingml/2006/picture">
                 <pic:pic xmlns:pic="http://schemas.openxmlformats.org/drawingml/2006/picture">
                   <pic:nvPicPr>
-                    <pic:cNvPr id="1449425618" name=""/>
+                    <pic:cNvPr id="1635772810" name=""/>
                     <pic:cNvPicPr/>
                   </pic:nvPicPr>
                   <pic:blipFill>
@@ -1296,7 +1306,7 @@
                   <pic:spPr>
                     <a:xfrm>
                       <a:off x="0" y="0"/>
-                      <a:ext cx="5731510" cy="3148330"/>
+                      <a:ext cx="5731510" cy="3179445"/>
                     </a:xfrm>
                     <a:prstGeom prst="rect">
                       <a:avLst/>
@@ -1313,29 +1323,39 @@
       <w:pPr>
         <w:spacing w:line="240" w:lineRule="auto"/>
         <w:rPr>
-          <w:sz w:val="32"/>
-          <w:szCs w:val="32"/>
-        </w:rPr>
-      </w:pPr>
-    </w:p>
-    <w:p>
-      <w:pPr>
-        <w:spacing w:line="240" w:lineRule="auto"/>
-        <w:rPr>
-          <w:b/>
-          <w:bCs/>
-          <w:sz w:val="32"/>
-          <w:szCs w:val="32"/>
-        </w:rPr>
-      </w:pPr>
-      <w:r>
-        <w:rPr>
-          <w:b/>
-          <w:bCs/>
-          <w:sz w:val="32"/>
-          <w:szCs w:val="32"/>
-        </w:rPr>
-        <w:lastRenderedPageBreak/>
+          <w:b/>
+          <w:bCs/>
+          <w:sz w:val="40"/>
+          <w:szCs w:val="40"/>
+        </w:rPr>
+      </w:pPr>
+    </w:p>
+    <w:p>
+      <w:pPr>
+        <w:spacing w:line="240" w:lineRule="auto"/>
+        <w:rPr>
+          <w:sz w:val="32"/>
+          <w:szCs w:val="32"/>
+        </w:rPr>
+      </w:pPr>
+    </w:p>
+    <w:p>
+      <w:pPr>
+        <w:spacing w:line="240" w:lineRule="auto"/>
+        <w:rPr>
+          <w:b/>
+          <w:bCs/>
+          <w:sz w:val="32"/>
+          <w:szCs w:val="32"/>
+        </w:rPr>
+      </w:pPr>
+      <w:r>
+        <w:rPr>
+          <w:b/>
+          <w:bCs/>
+          <w:sz w:val="32"/>
+          <w:szCs w:val="32"/>
+        </w:rPr>
         <w:t>Finding</w:t>
       </w:r>
       <w:r>
@@ -1736,6 +1756,7 @@
           <w:sz w:val="40"/>
           <w:szCs w:val="40"/>
         </w:rPr>
+        <w:lastRenderedPageBreak/>
         <w:t>Cancellation Rate by Deposit Type</w:t>
       </w:r>
     </w:p>
@@ -1804,19 +1825,29 @@
       </w:r>
     </w:p>
     <w:p>
-      <w:r>
-        <w:rPr>
-          <w:b/>
-          <w:bCs/>
-          <w:noProof/>
+      <w:pPr>
+        <w:tabs>
+          <w:tab w:val="left" w:pos="1267"/>
+        </w:tabs>
+        <w:rPr>
+          <w:b/>
+          <w:bCs/>
           <w:sz w:val="40"/>
           <w:szCs w:val="40"/>
         </w:rPr>
+      </w:pPr>
+      <w:r>
+        <w:rPr>
+          <w:b/>
+          <w:bCs/>
+          <w:sz w:val="40"/>
+          <w:szCs w:val="40"/>
+        </w:rPr>
         <w:drawing>
-          <wp:inline distT="0" distB="0" distL="0" distR="0" wp14:anchorId="59E8D490" wp14:editId="0428D2B0">
-            <wp:extent cx="6054190" cy="3657600"/>
-            <wp:effectExtent l="0" t="0" r="3810" b="0"/>
-            <wp:docPr id="1414976385" name="Picture 1"/>
+          <wp:inline distT="0" distB="0" distL="0" distR="0" wp14:anchorId="22F22CD3" wp14:editId="5A3B373E">
+            <wp:extent cx="5731510" cy="3484880"/>
+            <wp:effectExtent l="0" t="0" r="2540" b="1270"/>
+            <wp:docPr id="864934987" name="Picture 1"/>
             <wp:cNvGraphicFramePr>
               <a:graphicFrameLocks xmlns:a="http://schemas.openxmlformats.org/drawingml/2006/main" noChangeAspect="1"/>
             </wp:cNvGraphicFramePr>
@@ -1824,7 +1855,7 @@
               <a:graphicData uri="http://schemas.openxmlformats.org/drawingml/2006/picture">
                 <pic:pic xmlns:pic="http://schemas.openxmlformats.org/drawingml/2006/picture">
                   <pic:nvPicPr>
-                    <pic:cNvPr id="1414976385" name=""/>
+                    <pic:cNvPr id="864934987" name=""/>
                     <pic:cNvPicPr/>
                   </pic:nvPicPr>
                   <pic:blipFill>
@@ -1836,7 +1867,7 @@
                   <pic:spPr>
                     <a:xfrm>
                       <a:off x="0" y="0"/>
-                      <a:ext cx="6125250" cy="3700531"/>
+                      <a:ext cx="5731510" cy="3484880"/>
                     </a:xfrm>
                     <a:prstGeom prst="rect">
                       <a:avLst/>
@@ -1925,7 +1956,15 @@
         <w:t>22.22% for Refundable</w:t>
       </w:r>
       <w:r>
-        <w:t xml:space="preserve"> bookings. The Non Refund category therefore stands out as the deposit type most strongly associated with cancellations.</w:t>
+        <w:t xml:space="preserve"> bookings. The </w:t>
+      </w:r>
+      <w:proofErr w:type="gramStart"/>
+      <w:r>
+        <w:t>Non Refund</w:t>
+      </w:r>
+      <w:proofErr w:type="gramEnd"/>
+      <w:r>
+        <w:t xml:space="preserve"> category therefore stands out as the deposit type most strongly associated with cancellations.</w:t>
       </w:r>
     </w:p>
     <w:p>
@@ -1974,12 +2013,38 @@
     <w:p>
       <w:r>
         <w:lastRenderedPageBreak/>
-        <w:t>Deposit type appears to be an important factor associated with booking cancellations. The extremely high cancellation rate among Non Refund bookings suggests that this booking category requires further investigation.</w:t>
-      </w:r>
-    </w:p>
-    <w:p>
-      <w:r>
-        <w:t xml:space="preserve">Hotels should examine the characteristics of Non Refund bookings, such as </w:t>
+        <w:t xml:space="preserve">Deposit type appears to be an important factor associated with booking cancellations. The extremely high cancellation rate among </w:t>
+      </w:r>
+      <w:proofErr w:type="spellStart"/>
+      <w:proofErr w:type="gramStart"/>
+      <w:r>
+        <w:t>Non Refund</w:t>
+      </w:r>
+      <w:proofErr w:type="spellEnd"/>
+      <w:proofErr w:type="gramEnd"/>
+      <w:r>
+        <w:t xml:space="preserve"> bookings </w:t>
+      </w:r>
+      <w:proofErr w:type="gramStart"/>
+      <w:r>
+        <w:t>suggests</w:t>
+      </w:r>
+      <w:proofErr w:type="gramEnd"/>
+      <w:r>
+        <w:t xml:space="preserve"> that this booking category requires further investigation.</w:t>
+      </w:r>
+    </w:p>
+    <w:p>
+      <w:r>
+        <w:t xml:space="preserve">Hotels should examine the characteristics of </w:t>
+      </w:r>
+      <w:proofErr w:type="gramStart"/>
+      <w:r>
+        <w:t>Non Refund</w:t>
+      </w:r>
+      <w:proofErr w:type="gramEnd"/>
+      <w:r>
+        <w:t xml:space="preserve"> bookings, such as </w:t>
       </w:r>
       <w:r>
         <w:rPr>
@@ -2015,6 +2080,7 @@
       <w:r>
         <w:t xml:space="preserve">Investigate the </w:t>
       </w:r>
+      <w:proofErr w:type="gramStart"/>
       <w:r>
         <w:rPr>
           <w:b/>
@@ -2022,8 +2088,17 @@
         </w:rPr>
         <w:t>Non Refund</w:t>
       </w:r>
-      <w:r>
-        <w:t xml:space="preserve"> booking category to understand why its cancellation rate is exceptionally high. Analyze its relationship with </w:t>
+      <w:proofErr w:type="gramEnd"/>
+      <w:r>
+        <w:t xml:space="preserve"> booking category to understand why its cancellation rate is exceptionally high. </w:t>
+      </w:r>
+      <w:proofErr w:type="spellStart"/>
+      <w:r>
+        <w:t>Analyze</w:t>
+      </w:r>
+      <w:proofErr w:type="spellEnd"/>
+      <w:r>
+        <w:t xml:space="preserve"> its relationship with </w:t>
       </w:r>
       <w:r>
         <w:rPr>
@@ -2068,8 +2143,9 @@
           <w:sz w:val="36"/>
           <w:szCs w:val="36"/>
         </w:rPr>
-        <w:t xml:space="preserve">Step 4.1 : </w:t>
-      </w:r>
+        <w:t xml:space="preserve">Step </w:t>
+      </w:r>
+      <w:proofErr w:type="gramStart"/>
       <w:r>
         <w:rPr>
           <w:b/>
@@ -2077,7 +2153,46 @@
           <w:sz w:val="36"/>
           <w:szCs w:val="36"/>
         </w:rPr>
-        <w:t>Investigate the unusual high Non Refund cancellation rate</w:t>
+        <w:t>4.1 :</w:t>
+      </w:r>
+      <w:proofErr w:type="gramEnd"/>
+      <w:r>
+        <w:rPr>
+          <w:b/>
+          <w:bCs/>
+          <w:sz w:val="36"/>
+          <w:szCs w:val="36"/>
+        </w:rPr>
+        <w:t xml:space="preserve"> </w:t>
+      </w:r>
+      <w:r>
+        <w:rPr>
+          <w:b/>
+          <w:bCs/>
+          <w:sz w:val="36"/>
+          <w:szCs w:val="36"/>
+        </w:rPr>
+        <w:t xml:space="preserve">Investigate the unusual high </w:t>
+      </w:r>
+      <w:proofErr w:type="gramStart"/>
+      <w:r>
+        <w:rPr>
+          <w:b/>
+          <w:bCs/>
+          <w:sz w:val="36"/>
+          <w:szCs w:val="36"/>
+        </w:rPr>
+        <w:t>Non Refund</w:t>
+      </w:r>
+      <w:proofErr w:type="gramEnd"/>
+      <w:r>
+        <w:rPr>
+          <w:b/>
+          <w:bCs/>
+          <w:sz w:val="36"/>
+          <w:szCs w:val="36"/>
+        </w:rPr>
+        <w:t xml:space="preserve"> cancellation rate</w:t>
       </w:r>
     </w:p>
     <w:p>
@@ -2100,6 +2215,7 @@
         </w:rPr>
         <w:t xml:space="preserve">step </w:t>
       </w:r>
+      <w:proofErr w:type="gramStart"/>
       <w:r>
         <w:rPr>
           <w:b/>
@@ -2116,7 +2232,17 @@
           <w:sz w:val="32"/>
           <w:szCs w:val="32"/>
         </w:rPr>
-        <w:t>1 : Check the sample size</w:t>
+        <w:t>1 :</w:t>
+      </w:r>
+      <w:proofErr w:type="gramEnd"/>
+      <w:r>
+        <w:rPr>
+          <w:b/>
+          <w:bCs/>
+          <w:sz w:val="32"/>
+          <w:szCs w:val="32"/>
+        </w:rPr>
+        <w:t xml:space="preserve"> Check the sample size</w:t>
       </w:r>
     </w:p>
     <w:p>
@@ -2234,7 +2360,27 @@
           <w:sz w:val="32"/>
           <w:szCs w:val="32"/>
         </w:rPr>
-        <w:t>2: Look directly at the Non Refund bookings</w:t>
+        <w:t xml:space="preserve">2: Look directly at the </w:t>
+      </w:r>
+      <w:proofErr w:type="gramStart"/>
+      <w:r>
+        <w:rPr>
+          <w:b/>
+          <w:bCs/>
+          <w:sz w:val="32"/>
+          <w:szCs w:val="32"/>
+        </w:rPr>
+        <w:t>Non Refund</w:t>
+      </w:r>
+      <w:proofErr w:type="gramEnd"/>
+      <w:r>
+        <w:rPr>
+          <w:b/>
+          <w:bCs/>
+          <w:sz w:val="32"/>
+          <w:szCs w:val="32"/>
+        </w:rPr>
+        <w:t xml:space="preserve"> bookings</w:t>
       </w:r>
     </w:p>
     <w:p>
@@ -2337,7 +2483,27 @@
           <w:sz w:val="32"/>
           <w:szCs w:val="32"/>
         </w:rPr>
-        <w:t>3: Compare Non Refund cancellation rate by hotel</w:t>
+        <w:t xml:space="preserve">3: Compare </w:t>
+      </w:r>
+      <w:proofErr w:type="gramStart"/>
+      <w:r>
+        <w:rPr>
+          <w:b/>
+          <w:bCs/>
+          <w:sz w:val="32"/>
+          <w:szCs w:val="32"/>
+        </w:rPr>
+        <w:t>Non Refund</w:t>
+      </w:r>
+      <w:proofErr w:type="gramEnd"/>
+      <w:r>
+        <w:rPr>
+          <w:b/>
+          <w:bCs/>
+          <w:sz w:val="32"/>
+          <w:szCs w:val="32"/>
+        </w:rPr>
+        <w:t xml:space="preserve"> cancellation rate by hotel</w:t>
       </w:r>
     </w:p>
     <w:p>
@@ -2658,7 +2824,23 @@
       </w:pPr>
       <w:r>
         <w:lastRenderedPageBreak/>
-        <w:t>The investigation confirmed that the unusually high 99.36% cancellation rate for Non Refund bookings is a robust pattern rather than a result of a small sample size. There were 14,572 Non Refund bookings, of which 14,479 were cancelled, leaving only 93 non-cancelled bookings.</w:t>
+        <w:t xml:space="preserve">The investigation confirmed that the unusually high 99.36% cancellation rate for </w:t>
+      </w:r>
+      <w:proofErr w:type="gramStart"/>
+      <w:r>
+        <w:t>Non Refund</w:t>
+      </w:r>
+      <w:proofErr w:type="gramEnd"/>
+      <w:r>
+        <w:t xml:space="preserve"> bookings is a robust pattern rather than a result of a small sample size. There were 14,572 </w:t>
+      </w:r>
+      <w:proofErr w:type="gramStart"/>
+      <w:r>
+        <w:t>Non Refund</w:t>
+      </w:r>
+      <w:proofErr w:type="gramEnd"/>
+      <w:r>
+        <w:t xml:space="preserve"> bookings, of which 14,479 were cancelled, leaving only 93 non-cancelled bookings.</w:t>
       </w:r>
     </w:p>
     <w:p>
@@ -2676,7 +2858,15 @@
         <w:ind w:left="360"/>
       </w:pPr>
       <w:r>
-        <w:t>Further investigation showed that Non Refund cancellations were particularly concentrated in the Offline TA/TO and Groups market segments, which recorded cancellation rates of 99.94% and 99.32%, respectively. The distribution-channel analysis showed a similar pattern, with TA/TO bookings recording a 99.61% cancellation rate.</w:t>
+        <w:t xml:space="preserve">Further investigation showed that </w:t>
+      </w:r>
+      <w:proofErr w:type="gramStart"/>
+      <w:r>
+        <w:t>Non Refund</w:t>
+      </w:r>
+      <w:proofErr w:type="gramEnd"/>
+      <w:r>
+        <w:t xml:space="preserve"> cancellations were particularly concentrated in the Offline TA/TO and Groups market segments, which recorded cancellation rates of 99.94% and 99.32%, respectively. The distribution-channel analysis showed a similar pattern, with TA/TO bookings recording a 99.61% cancellation rate.</w:t>
       </w:r>
     </w:p>
     <w:p>
@@ -2685,7 +2875,23 @@
         <w:ind w:left="360"/>
       </w:pPr>
       <w:r>
-        <w:t>Overall, the evidence indicates a strong association between Non Refund bookings and cancellations, particularly among group and travel-agent/tour-operator bookings. However, this analysis does not establish that the Non Refund deposit type itself causes cancellations. The pattern may reflect underlying booking policies, group-booking practices, travel-agent/tour-operator processes, or other factors associated with these booking types.</w:t>
+        <w:t xml:space="preserve">Overall, the evidence indicates a strong association between </w:t>
+      </w:r>
+      <w:proofErr w:type="gramStart"/>
+      <w:r>
+        <w:t>Non Refund</w:t>
+      </w:r>
+      <w:proofErr w:type="gramEnd"/>
+      <w:r>
+        <w:t xml:space="preserve"> bookings and cancellations, particularly among group and travel-agent/tour-operator bookings. However, this analysis does not establish that the </w:t>
+      </w:r>
+      <w:proofErr w:type="gramStart"/>
+      <w:r>
+        <w:t>Non Refund</w:t>
+      </w:r>
+      <w:proofErr w:type="gramEnd"/>
+      <w:r>
+        <w:t xml:space="preserve"> deposit type itself causes cancellations. The pattern may reflect underlying booking policies, group-booking practices, travel-agent/tour-operator processes, or other factors associated with these booking types.</w:t>
       </w:r>
     </w:p>
     <w:p>
@@ -2694,7 +2900,15 @@
         <w:ind w:left="360"/>
       </w:pPr>
       <w:r>
-        <w:t>This finding is therefore important for hotel management because Non Refund bookings represent a high-risk cancellation segment and warrant further investigation into booking policies, contract terms, and channel-specific practices.</w:t>
+        <w:t xml:space="preserve">This finding is therefore important for hotel management because </w:t>
+      </w:r>
+      <w:proofErr w:type="gramStart"/>
+      <w:r>
+        <w:t>Non Refund</w:t>
+      </w:r>
+      <w:proofErr w:type="gramEnd"/>
+      <w:r>
+        <w:t xml:space="preserve"> bookings represent a high-risk cancellation segment and warrant further investigation into booking policies, contract terms, and channel-specific practices.</w:t>
       </w:r>
     </w:p>
     <w:p>

</xml_diff>

<commit_message>
Plot Cancellation rate by Booking Channel
</commit_message>
<xml_diff>
--- a/Report/Report.docx
+++ b/Report/Report.docx
@@ -691,6 +691,9 @@
         <w:spacing w:line="240" w:lineRule="auto"/>
       </w:pPr>
       <w:r>
+        <w:rPr>
+          <w:noProof/>
+        </w:rPr>
         <w:drawing>
           <wp:inline distT="0" distB="0" distL="0" distR="0" wp14:anchorId="331F101E" wp14:editId="69EF97C8">
             <wp:extent cx="4361699" cy="3268133"/>
@@ -961,6 +964,7 @@
         <w:rPr>
           <w:b/>
           <w:bCs/>
+          <w:noProof/>
           <w:sz w:val="40"/>
           <w:szCs w:val="40"/>
         </w:rPr>
@@ -1279,6 +1283,7 @@
         <w:rPr>
           <w:b/>
           <w:bCs/>
+          <w:noProof/>
           <w:sz w:val="40"/>
           <w:szCs w:val="40"/>
         </w:rPr>
@@ -1840,6 +1845,7 @@
         <w:rPr>
           <w:b/>
           <w:bCs/>
+          <w:noProof/>
           <w:sz w:val="40"/>
           <w:szCs w:val="40"/>
         </w:rPr>
@@ -2272,6 +2278,7 @@
         <w:rPr>
           <w:b/>
           <w:bCs/>
+          <w:noProof/>
           <w:sz w:val="32"/>
           <w:szCs w:val="32"/>
         </w:rPr>
@@ -2398,6 +2405,7 @@
         <w:rPr>
           <w:b/>
           <w:bCs/>
+          <w:noProof/>
           <w:sz w:val="32"/>
           <w:szCs w:val="32"/>
         </w:rPr>
@@ -2521,6 +2529,7 @@
         <w:rPr>
           <w:b/>
           <w:bCs/>
+          <w:noProof/>
           <w:sz w:val="32"/>
           <w:szCs w:val="32"/>
         </w:rPr>
@@ -2626,6 +2635,7 @@
         <w:rPr>
           <w:b/>
           <w:bCs/>
+          <w:noProof/>
           <w:sz w:val="40"/>
           <w:szCs w:val="40"/>
         </w:rPr>
@@ -2744,6 +2754,7 @@
         <w:rPr>
           <w:b/>
           <w:bCs/>
+          <w:noProof/>
           <w:sz w:val="40"/>
           <w:szCs w:val="40"/>
         </w:rPr>
@@ -2909,6 +2920,279 @@
       <w:proofErr w:type="gramEnd"/>
       <w:r>
         <w:t xml:space="preserve"> bookings represent a high-risk cancellation segment and warrant further investigation into booking policies, contract terms, and channel-specific practices.</w:t>
+      </w:r>
+    </w:p>
+    <w:p>
+      <w:pPr>
+        <w:spacing w:line="240" w:lineRule="auto"/>
+        <w:ind w:left="360"/>
+        <w:rPr>
+          <w:b/>
+          <w:bCs/>
+          <w:sz w:val="40"/>
+          <w:szCs w:val="40"/>
+        </w:rPr>
+      </w:pPr>
+    </w:p>
+    <w:p>
+      <w:pPr>
+        <w:spacing w:line="240" w:lineRule="auto"/>
+        <w:ind w:left="360"/>
+        <w:rPr>
+          <w:b/>
+          <w:bCs/>
+          <w:sz w:val="40"/>
+          <w:szCs w:val="40"/>
+        </w:rPr>
+      </w:pPr>
+    </w:p>
+    <w:p>
+      <w:pPr>
+        <w:spacing w:line="240" w:lineRule="auto"/>
+        <w:ind w:left="360"/>
+        <w:rPr>
+          <w:b/>
+          <w:bCs/>
+          <w:sz w:val="40"/>
+          <w:szCs w:val="40"/>
+        </w:rPr>
+      </w:pPr>
+    </w:p>
+    <w:p>
+      <w:pPr>
+        <w:spacing w:line="240" w:lineRule="auto"/>
+        <w:ind w:left="360"/>
+        <w:rPr>
+          <w:b/>
+          <w:bCs/>
+          <w:sz w:val="40"/>
+          <w:szCs w:val="40"/>
+        </w:rPr>
+      </w:pPr>
+    </w:p>
+    <w:p>
+      <w:pPr>
+        <w:spacing w:line="240" w:lineRule="auto"/>
+        <w:ind w:left="360"/>
+        <w:rPr>
+          <w:b/>
+          <w:bCs/>
+          <w:sz w:val="40"/>
+          <w:szCs w:val="40"/>
+        </w:rPr>
+      </w:pPr>
+    </w:p>
+    <w:p>
+      <w:pPr>
+        <w:spacing w:line="240" w:lineRule="auto"/>
+        <w:ind w:left="360"/>
+        <w:rPr>
+          <w:b/>
+          <w:bCs/>
+          <w:sz w:val="40"/>
+          <w:szCs w:val="40"/>
+        </w:rPr>
+      </w:pPr>
+    </w:p>
+    <w:p>
+      <w:pPr>
+        <w:spacing w:line="240" w:lineRule="auto"/>
+        <w:ind w:left="360"/>
+        <w:rPr>
+          <w:b/>
+          <w:bCs/>
+          <w:sz w:val="40"/>
+          <w:szCs w:val="40"/>
+        </w:rPr>
+      </w:pPr>
+    </w:p>
+    <w:p>
+      <w:pPr>
+        <w:spacing w:line="240" w:lineRule="auto"/>
+        <w:ind w:left="360"/>
+        <w:rPr>
+          <w:b/>
+          <w:bCs/>
+          <w:sz w:val="40"/>
+          <w:szCs w:val="40"/>
+        </w:rPr>
+      </w:pPr>
+    </w:p>
+    <w:p>
+      <w:pPr>
+        <w:spacing w:line="240" w:lineRule="auto"/>
+        <w:ind w:left="360"/>
+        <w:rPr>
+          <w:b/>
+          <w:bCs/>
+          <w:sz w:val="40"/>
+          <w:szCs w:val="40"/>
+        </w:rPr>
+      </w:pPr>
+    </w:p>
+    <w:p>
+      <w:pPr>
+        <w:spacing w:line="240" w:lineRule="auto"/>
+        <w:ind w:left="360"/>
+        <w:rPr>
+          <w:b/>
+          <w:bCs/>
+          <w:sz w:val="40"/>
+          <w:szCs w:val="40"/>
+        </w:rPr>
+      </w:pPr>
+    </w:p>
+    <w:p>
+      <w:pPr>
+        <w:spacing w:line="240" w:lineRule="auto"/>
+        <w:ind w:left="360"/>
+        <w:rPr>
+          <w:b/>
+          <w:bCs/>
+          <w:sz w:val="40"/>
+          <w:szCs w:val="40"/>
+        </w:rPr>
+      </w:pPr>
+    </w:p>
+    <w:p>
+      <w:pPr>
+        <w:spacing w:line="240" w:lineRule="auto"/>
+        <w:ind w:left="360"/>
+        <w:rPr>
+          <w:b/>
+          <w:bCs/>
+          <w:sz w:val="40"/>
+          <w:szCs w:val="40"/>
+        </w:rPr>
+      </w:pPr>
+      <w:r>
+        <w:rPr>
+          <w:b/>
+          <w:bCs/>
+          <w:sz w:val="40"/>
+          <w:szCs w:val="40"/>
+        </w:rPr>
+        <w:lastRenderedPageBreak/>
+        <w:t xml:space="preserve">Step 5: </w:t>
+      </w:r>
+      <w:r>
+        <w:rPr>
+          <w:b/>
+          <w:bCs/>
+          <w:sz w:val="40"/>
+          <w:szCs w:val="40"/>
+        </w:rPr>
+        <w:t>Booking Outcome by Distribution Channel</w:t>
+      </w:r>
+    </w:p>
+    <w:p>
+      <w:pPr>
+        <w:spacing w:line="240" w:lineRule="auto"/>
+        <w:ind w:left="360"/>
+        <w:rPr>
+          <w:b/>
+          <w:bCs/>
+          <w:sz w:val="40"/>
+          <w:szCs w:val="40"/>
+        </w:rPr>
+      </w:pPr>
+      <w:r>
+        <w:rPr>
+          <w:b/>
+          <w:bCs/>
+          <w:sz w:val="40"/>
+          <w:szCs w:val="40"/>
+        </w:rPr>
+        <w:drawing>
+          <wp:inline distT="0" distB="0" distL="0" distR="0" wp14:anchorId="6EA03F66" wp14:editId="14AD2A16">
+            <wp:extent cx="5391902" cy="1733792"/>
+            <wp:effectExtent l="0" t="0" r="0" b="0"/>
+            <wp:docPr id="587139971" name="Picture 1"/>
+            <wp:cNvGraphicFramePr>
+              <a:graphicFrameLocks xmlns:a="http://schemas.openxmlformats.org/drawingml/2006/main" noChangeAspect="1"/>
+            </wp:cNvGraphicFramePr>
+            <a:graphic xmlns:a="http://schemas.openxmlformats.org/drawingml/2006/main">
+              <a:graphicData uri="http://schemas.openxmlformats.org/drawingml/2006/picture">
+                <pic:pic xmlns:pic="http://schemas.openxmlformats.org/drawingml/2006/picture">
+                  <pic:nvPicPr>
+                    <pic:cNvPr id="587139971" name=""/>
+                    <pic:cNvPicPr/>
+                  </pic:nvPicPr>
+                  <pic:blipFill>
+                    <a:blip r:embed="rId18"/>
+                    <a:stretch>
+                      <a:fillRect/>
+                    </a:stretch>
+                  </pic:blipFill>
+                  <pic:spPr>
+                    <a:xfrm>
+                      <a:off x="0" y="0"/>
+                      <a:ext cx="5391902" cy="1733792"/>
+                    </a:xfrm>
+                    <a:prstGeom prst="rect">
+                      <a:avLst/>
+                    </a:prstGeom>
+                  </pic:spPr>
+                </pic:pic>
+              </a:graphicData>
+            </a:graphic>
+          </wp:inline>
+        </w:drawing>
+      </w:r>
+    </w:p>
+    <w:p>
+      <w:pPr>
+        <w:spacing w:line="240" w:lineRule="auto"/>
+        <w:ind w:left="360"/>
+        <w:rPr>
+          <w:b/>
+          <w:bCs/>
+          <w:sz w:val="40"/>
+          <w:szCs w:val="40"/>
+        </w:rPr>
+      </w:pPr>
+      <w:r>
+        <w:rPr>
+          <w:b/>
+          <w:bCs/>
+          <w:sz w:val="40"/>
+          <w:szCs w:val="40"/>
+        </w:rPr>
+        <w:drawing>
+          <wp:inline distT="0" distB="0" distL="0" distR="0" wp14:anchorId="0B30D2BA" wp14:editId="6CF3D1FA">
+            <wp:extent cx="5731510" cy="3257550"/>
+            <wp:effectExtent l="0" t="0" r="2540" b="0"/>
+            <wp:docPr id="1704759364" name="Picture 1"/>
+            <wp:cNvGraphicFramePr>
+              <a:graphicFrameLocks xmlns:a="http://schemas.openxmlformats.org/drawingml/2006/main" noChangeAspect="1"/>
+            </wp:cNvGraphicFramePr>
+            <a:graphic xmlns:a="http://schemas.openxmlformats.org/drawingml/2006/main">
+              <a:graphicData uri="http://schemas.openxmlformats.org/drawingml/2006/picture">
+                <pic:pic xmlns:pic="http://schemas.openxmlformats.org/drawingml/2006/picture">
+                  <pic:nvPicPr>
+                    <pic:cNvPr id="1704759364" name=""/>
+                    <pic:cNvPicPr/>
+                  </pic:nvPicPr>
+                  <pic:blipFill>
+                    <a:blip r:embed="rId19"/>
+                    <a:stretch>
+                      <a:fillRect/>
+                    </a:stretch>
+                  </pic:blipFill>
+                  <pic:spPr>
+                    <a:xfrm>
+                      <a:off x="0" y="0"/>
+                      <a:ext cx="5731510" cy="3257550"/>
+                    </a:xfrm>
+                    <a:prstGeom prst="rect">
+                      <a:avLst/>
+                    </a:prstGeom>
+                  </pic:spPr>
+                </pic:pic>
+              </a:graphicData>
+            </a:graphic>
+          </wp:inline>
+        </w:drawing>
       </w:r>
     </w:p>
     <w:p>

</xml_diff>

<commit_message>
Step 7 Customer Type Framing for a Bar chart instead of Pie chart
</commit_message>
<xml_diff>
--- a/Report/Report.docx
+++ b/Report/Report.docx
@@ -753,14 +753,13 @@
         <w:spacing w:line="240" w:lineRule="auto"/>
       </w:pPr>
       <w:r>
-        <w:rPr>
-          <w:b/>
-          <w:bCs/>
-        </w:rPr>
-        <w:t>Finding:</w:t>
-      </w:r>
-      <w:r>
-        <w:t> The overall cancellation rate is 37.04%, meaning approximately 37.13% of bookings in the dataset were cancel</w:t>
+        <w:t>The overall cancellation rate is 37.</w:t>
+      </w:r>
+      <w:r>
+        <w:t>13</w:t>
+      </w:r>
+      <w:r>
+        <w:t>%, meaning approximately 37.13% of bookings in the dataset were cancel</w:t>
       </w:r>
       <w:r>
         <w:t>l</w:t>

</xml_diff>